<commit_message>
Completed Lab task 3
</commit_message>
<xml_diff>
--- a/lab3/output.docx
+++ b/lab3/output.docx
@@ -40,26 +40,7 @@
           <w:bCs/>
           <w:sz w:val="32"/>
           <w:szCs w:val="32"/>
-        </w:rPr>
-      </w:r>
-      <w:r>
-        <w:rPr>
-          <w:b/>
-          <w:bCs/>
-          <w:sz w:val="32"/>
-          <w:szCs w:val="32"/>
-        </w:rPr>
-      </w:r>
-      <w:r>
-        <w:rPr>
-          <w:sz w:val="32"/>
-          <w:szCs w:val="32"/>
-        </w:rPr>
-      </w:r>
-      <w:r>
-        <w:rPr>
-          <w:sz w:val="32"/>
-          <w:szCs w:val="32"/>
+          <w:highlight w:val="none"/>
         </w:rPr>
       </w:r>
       <w:r>
@@ -129,19 +110,6 @@
           <w:u w:val="single"/>
         </w:rPr>
       </w:r>
-    </w:p>
-    <w:p>
-      <w:pPr>
-        <w:pBdr/>
-        <w:spacing/>
-        <w:ind/>
-        <w:rPr>
-          <w:sz w:val="28"/>
-          <w:szCs w:val="28"/>
-          <w:highlight w:val="none"/>
-          <w:u w:val="single"/>
-        </w:rPr>
-      </w:pPr>
       <w:r>
         <w:rPr>
           <w:sz w:val="28"/>
@@ -150,6 +118,19 @@
           <w:u w:val="single"/>
         </w:rPr>
       </w:r>
+    </w:p>
+    <w:p>
+      <w:pPr>
+        <w:pBdr/>
+        <w:spacing/>
+        <w:ind/>
+        <w:rPr>
+          <w:sz w:val="28"/>
+          <w:szCs w:val="28"/>
+          <w:highlight w:val="none"/>
+          <w:u w:val="single"/>
+        </w:rPr>
+      </w:pPr>
       <w:r>
         <w:rPr>
           <w:sz w:val="28"/>
@@ -243,14 +224,6 @@
           <w:u w:val="single"/>
         </w:rPr>
       </w:r>
-      <w:r>
-        <w:rPr>
-          <w:sz w:val="28"/>
-          <w:szCs w:val="28"/>
-          <w:highlight w:val="none"/>
-          <w:u w:val="single"/>
-        </w:rPr>
-      </w:r>
     </w:p>
     <w:p>
       <w:pPr>
@@ -288,6 +261,19 @@
           <w:u w:val="single"/>
         </w:rPr>
       </w:r>
+    </w:p>
+    <w:p>
+      <w:pPr>
+        <w:pBdr/>
+        <w:spacing/>
+        <w:ind/>
+        <w:rPr>
+          <w:sz w:val="28"/>
+          <w:szCs w:val="28"/>
+          <w:highlight w:val="none"/>
+          <w:u w:val="single"/>
+        </w:rPr>
+      </w:pPr>
       <w:r>
         <w:rPr>
           <w:sz w:val="28"/>
@@ -296,36 +282,6 @@
           <w:u w:val="single"/>
         </w:rPr>
       </w:r>
-    </w:p>
-    <w:p>
-      <w:pPr>
-        <w:pBdr/>
-        <w:spacing/>
-        <w:ind/>
-        <w:rPr>
-          <w:sz w:val="28"/>
-          <w:szCs w:val="28"/>
-          <w:highlight w:val="none"/>
-          <w:u w:val="single"/>
-        </w:rPr>
-      </w:pPr>
-      <w:r>
-        <w:rPr>
-          <w:sz w:val="28"/>
-          <w:szCs w:val="28"/>
-          <w:highlight w:val="none"/>
-          <w:u w:val="single"/>
-        </w:rPr>
-      </w:r>
-      <w:r>
-        <w:rPr>
-          <w:sz w:val="28"/>
-          <w:szCs w:val="28"/>
-          <w:highlight w:val="none"/>
-          <w:u w:val="single"/>
-        </w:rPr>
-      </w:r>
-      <w:r/>
       <w:r>
         <mc:AlternateContent>
           <mc:Choice Requires="wpg">
@@ -395,7 +351,6 @@
           </mc:Fallback>
         </mc:AlternateContent>
       </w:r>
-      <w:r/>
       <w:r>
         <w:rPr>
           <w:sz w:val="28"/>
@@ -462,14 +417,6 @@
           <w:u w:val="single"/>
         </w:rPr>
       </w:pPr>
-      <w:r>
-        <w:rPr>
-          <w:sz w:val="28"/>
-          <w:szCs w:val="28"/>
-          <w:highlight w:val="none"/>
-          <w:u w:val="single"/>
-        </w:rPr>
-      </w:r>
       <w:r>
         <w:rPr>
           <w:sz w:val="28"/>
@@ -622,14 +569,6 @@
         </w:rPr>
       </w:r>
       <w:r>
-        <w:rPr>
-          <w:sz w:val="28"/>
-          <w:szCs w:val="28"/>
-          <w:highlight w:val="none"/>
-          <w:u w:val="single"/>
-        </w:rPr>
-      </w:r>
-      <w:r>
         <mc:AlternateContent>
           <mc:Choice Requires="wpg">
             <w:drawing>
@@ -764,14 +703,6 @@
           <w:u w:val="single"/>
         </w:rPr>
       </w:pPr>
-      <w:r>
-        <w:rPr>
-          <w:sz w:val="28"/>
-          <w:szCs w:val="28"/>
-          <w:highlight w:val="none"/>
-          <w:u w:val="single"/>
-        </w:rPr>
-      </w:r>
       <w:r>
         <w:rPr>
           <w:sz w:val="28"/>
@@ -924,14 +855,6 @@
         </w:rPr>
       </w:r>
       <w:r>
-        <w:rPr>
-          <w:sz w:val="28"/>
-          <w:szCs w:val="28"/>
-          <w:highlight w:val="none"/>
-          <w:u w:val="single"/>
-        </w:rPr>
-      </w:r>
-      <w:r>
         <mc:AlternateContent>
           <mc:Choice Requires="wpg">
             <w:drawing>
@@ -1103,14 +1026,6 @@
           <w:u w:val="single"/>
         </w:rPr>
       </w:pPr>
-      <w:r>
-        <w:rPr>
-          <w:sz w:val="28"/>
-          <w:szCs w:val="28"/>
-          <w:highlight w:val="none"/>
-          <w:u w:val="single"/>
-        </w:rPr>
-      </w:r>
       <w:r>
         <w:rPr>
           <w:sz w:val="28"/>
@@ -1241,6 +1156,112 @@
           <w:u w:val="single"/>
         </w:rPr>
       </w:r>
+    </w:p>
+    <w:p>
+      <w:pPr>
+        <w:pBdr/>
+        <w:spacing/>
+        <w:ind/>
+        <w:rPr>
+          <w:sz w:val="28"/>
+          <w:szCs w:val="28"/>
+          <w:highlight w:val="none"/>
+          <w:u w:val="single"/>
+        </w:rPr>
+      </w:pPr>
+      <w:r>
+        <w:rPr>
+          <w:sz w:val="28"/>
+          <w:szCs w:val="28"/>
+          <w:highlight w:val="none"/>
+          <w:u w:val="single"/>
+        </w:rPr>
+      </w:r>
+      <w:r>
+        <w:rPr>
+          <w:sz w:val="28"/>
+          <w:szCs w:val="28"/>
+          <w:highlight w:val="none"/>
+          <w:u w:val="single"/>
+        </w:rPr>
+      </w:r>
+      <w:r>
+        <mc:AlternateContent>
+          <mc:Choice Requires="wpg">
+            <w:drawing>
+              <wp:inline xmlns:wp="http://schemas.openxmlformats.org/drawingml/2006/wordprocessingDrawing" distT="0" distB="0" distL="0" distR="0">
+                <wp:extent cx="5629275" cy="1676400"/>
+                <wp:effectExtent l="0" t="0" r="0" b="0"/>
+                <wp:docPr id="8" name=""/>
+                <wp:cNvGraphicFramePr>
+                  <a:graphicFrameLocks xmlns:a="http://schemas.openxmlformats.org/drawingml/2006/main" noChangeAspect="1"/>
+                </wp:cNvGraphicFramePr>
+                <a:graphic xmlns:a="http://schemas.openxmlformats.org/drawingml/2006/main">
+                  <a:graphicData uri="http://schemas.openxmlformats.org/drawingml/2006/picture">
+                    <pic:pic xmlns:pic="http://schemas.openxmlformats.org/drawingml/2006/picture">
+                      <pic:nvPicPr>
+                        <pic:cNvPr id="1972938958" name=""/>
+                        <pic:cNvPicPr>
+                          <a:picLocks noChangeAspect="1"/>
+                        </pic:cNvPicPr>
+                        <pic:nvPr/>
+                      </pic:nvPicPr>
+                      <pic:blipFill rotWithShape="1">
+                        <a:blip r:embed="rId15"/>
+                        <a:stretch/>
+                      </pic:blipFill>
+                      <pic:spPr bwMode="auto">
+                        <a:xfrm>
+                          <a:off x="0" y="0"/>
+                          <a:ext cx="5629275" cy="1676399"/>
+                        </a:xfrm>
+                        <a:prstGeom prst="rect">
+                          <a:avLst/>
+                        </a:prstGeom>
+                      </pic:spPr>
+                    </pic:pic>
+                  </a:graphicData>
+                </a:graphic>
+              </wp:inline>
+            </w:drawing>
+          </mc:Choice>
+          <mc:Fallback>
+            <w:pict>
+              <v:shapetype id="_x0000_t75" coordsize="21600,21600" o:spt="75" o:preferrelative="t" path="m@4@5l@4@11@9@11@9@5xe" filled="f" stroked="f">
+                <v:stroke joinstyle="miter"/>
+                <v:formulas>
+                  <v:f eqn="if lineDrawn pixelLineWidth 0"/>
+                  <v:f eqn="sum @0 1 0"/>
+                  <v:f eqn="sum 0 0 @1"/>
+                  <v:f eqn="prod @2 1 2"/>
+                  <v:f eqn="prod @3 21600 pixelWidth"/>
+                  <v:f eqn="prod @3 21600 pixelHeight"/>
+                  <v:f eqn="sum @0 0 1"/>
+                  <v:f eqn="prod @6 1 2"/>
+                  <v:f eqn="prod @7 21600 pixelWidth"/>
+                  <v:f eqn="sum @8 21600 0"/>
+                  <v:f eqn="prod @7 21600 pixelHeight"/>
+                  <v:f eqn="sum @10 21600 0"/>
+                </v:formulas>
+                <v:path o:extrusionok="f" gradientshapeok="t" o:connecttype="rect"/>
+                <o:lock v:ext="edit" aspectratio="t"/>
+              </v:shapetype>
+              <v:shape id="_x0000_i7" o:spid="_x0000_s7" type="#_x0000_t75" style="width:443.25pt;height:132.00pt;mso-wrap-distance-left:0.00pt;mso-wrap-distance-top:0.00pt;mso-wrap-distance-right:0.00pt;mso-wrap-distance-bottom:0.00pt;z-index:1;" stroked="false">
+                <v:imagedata r:id="rId15" o:title=""/>
+                <o:lock v:ext="edit" rotation="t"/>
+              </v:shape>
+            </w:pict>
+          </mc:Fallback>
+        </mc:AlternateContent>
+      </w:r>
+      <w:r>
+        <w:rPr>
+          <w:sz w:val="28"/>
+          <w:szCs w:val="28"/>
+          <w:highlight w:val="none"/>
+          <w:u w:val="single"/>
+        </w:rPr>
+      </w:r>
       <w:r>
         <w:rPr>
           <w:sz w:val="28"/>
@@ -1260,6 +1281,204 @@
           <w:szCs w:val="28"/>
           <w:highlight w:val="none"/>
           <w:u w:val="single"/>
+        </w:rPr>
+      </w:pPr>
+      <w:r>
+        <w:rPr>
+          <w:sz w:val="28"/>
+          <w:szCs w:val="28"/>
+          <w:u w:val="single"/>
+        </w:rPr>
+        <w:t xml:space="preserve">Step 9 Output:</w:t>
+      </w:r>
+      <w:r>
+        <w:rPr>
+          <w:sz w:val="28"/>
+          <w:szCs w:val="28"/>
+          <w:highlight w:val="none"/>
+          <w:u w:val="single"/>
+        </w:rPr>
+      </w:r>
+      <w:r>
+        <w:rPr>
+          <w:sz w:val="28"/>
+          <w:szCs w:val="28"/>
+          <w:highlight w:val="none"/>
+          <w:u w:val="single"/>
+        </w:rPr>
+      </w:r>
+    </w:p>
+    <w:p>
+      <w:pPr>
+        <w:pBdr/>
+        <w:spacing/>
+        <w:ind/>
+        <w:rPr>
+          <w:sz w:val="28"/>
+          <w:szCs w:val="28"/>
+          <w:highlight w:val="none"/>
+          <w:u w:val="single"/>
+        </w:rPr>
+      </w:pPr>
+      <w:r>
+        <w:rPr>
+          <w:highlight w:val="none"/>
+        </w:rPr>
+      </w:r>
+      <w:r>
+        <w:rPr>
+          <w:highlight w:val="none"/>
+        </w:rPr>
+      </w:r>
+      <w:r>
+        <w:rPr>
+          <w:highlight w:val="none"/>
+        </w:rPr>
+      </w:r>
+    </w:p>
+    <w:p>
+      <w:pPr>
+        <w:pBdr/>
+        <w:spacing/>
+        <w:ind/>
+        <w:rPr>
+          <w:sz w:val="28"/>
+          <w:szCs w:val="28"/>
+          <w:highlight w:val="none"/>
+          <w:u w:val="single"/>
+        </w:rPr>
+      </w:pPr>
+      <w:r>
+        <w:rPr>
+          <w:sz w:val="28"/>
+          <w:szCs w:val="28"/>
+          <w:highlight w:val="none"/>
+          <w:u w:val="single"/>
+        </w:rPr>
+      </w:r>
+      <w:r>
+        <w:rPr>
+          <w:sz w:val="28"/>
+          <w:szCs w:val="28"/>
+          <w:highlight w:val="none"/>
+          <w:u w:val="single"/>
+        </w:rPr>
+      </w:r>
+      <w:r>
+        <mc:AlternateContent>
+          <mc:Choice Requires="wpg">
+            <w:drawing>
+              <wp:inline xmlns:wp="http://schemas.openxmlformats.org/drawingml/2006/wordprocessingDrawing" distT="0" distB="0" distL="0" distR="0">
+                <wp:extent cx="2505075" cy="1676400"/>
+                <wp:effectExtent l="0" t="0" r="0" b="0"/>
+                <wp:docPr id="9" name=""/>
+                <wp:cNvGraphicFramePr>
+                  <a:graphicFrameLocks xmlns:a="http://schemas.openxmlformats.org/drawingml/2006/main" noChangeAspect="1"/>
+                </wp:cNvGraphicFramePr>
+                <a:graphic xmlns:a="http://schemas.openxmlformats.org/drawingml/2006/main">
+                  <a:graphicData uri="http://schemas.openxmlformats.org/drawingml/2006/picture">
+                    <pic:pic xmlns:pic="http://schemas.openxmlformats.org/drawingml/2006/picture">
+                      <pic:nvPicPr>
+                        <pic:cNvPr id="1080178876" name=""/>
+                        <pic:cNvPicPr>
+                          <a:picLocks noChangeAspect="1"/>
+                        </pic:cNvPicPr>
+                        <pic:nvPr/>
+                      </pic:nvPicPr>
+                      <pic:blipFill rotWithShape="1">
+                        <a:blip r:embed="rId16"/>
+                        <a:stretch/>
+                      </pic:blipFill>
+                      <pic:spPr bwMode="auto">
+                        <a:xfrm>
+                          <a:off x="0" y="0"/>
+                          <a:ext cx="2505074" cy="1676399"/>
+                        </a:xfrm>
+                        <a:prstGeom prst="rect">
+                          <a:avLst/>
+                        </a:prstGeom>
+                      </pic:spPr>
+                    </pic:pic>
+                  </a:graphicData>
+                </a:graphic>
+              </wp:inline>
+            </w:drawing>
+          </mc:Choice>
+          <mc:Fallback>
+            <w:pict>
+              <v:shapetype id="_x0000_t75" coordsize="21600,21600" o:spt="75" o:preferrelative="t" path="m@4@5l@4@11@9@11@9@5xe" filled="f" stroked="f">
+                <v:stroke joinstyle="miter"/>
+                <v:formulas>
+                  <v:f eqn="if lineDrawn pixelLineWidth 0"/>
+                  <v:f eqn="sum @0 1 0"/>
+                  <v:f eqn="sum 0 0 @1"/>
+                  <v:f eqn="prod @2 1 2"/>
+                  <v:f eqn="prod @3 21600 pixelWidth"/>
+                  <v:f eqn="prod @3 21600 pixelHeight"/>
+                  <v:f eqn="sum @0 0 1"/>
+                  <v:f eqn="prod @6 1 2"/>
+                  <v:f eqn="prod @7 21600 pixelWidth"/>
+                  <v:f eqn="sum @8 21600 0"/>
+                  <v:f eqn="prod @7 21600 pixelHeight"/>
+                  <v:f eqn="sum @10 21600 0"/>
+                </v:formulas>
+                <v:path o:extrusionok="f" gradientshapeok="t" o:connecttype="rect"/>
+                <o:lock v:ext="edit" aspectratio="t"/>
+              </v:shapetype>
+              <v:shape id="_x0000_i8" o:spid="_x0000_s8" type="#_x0000_t75" style="width:197.25pt;height:132.00pt;mso-wrap-distance-left:0.00pt;mso-wrap-distance-top:0.00pt;mso-wrap-distance-right:0.00pt;mso-wrap-distance-bottom:0.00pt;z-index:1;" stroked="false">
+                <v:imagedata r:id="rId16" o:title=""/>
+                <o:lock v:ext="edit" rotation="t"/>
+              </v:shape>
+            </w:pict>
+          </mc:Fallback>
+        </mc:AlternateContent>
+      </w:r>
+      <w:r>
+        <w:rPr>
+          <w:sz w:val="28"/>
+          <w:szCs w:val="28"/>
+          <w:highlight w:val="none"/>
+          <w:u w:val="single"/>
+        </w:rPr>
+      </w:r>
+      <w:r>
+        <w:rPr>
+          <w:highlight w:val="none"/>
+        </w:rPr>
+      </w:r>
+    </w:p>
+    <w:p>
+      <w:pPr>
+        <w:pBdr/>
+        <w:spacing/>
+        <w:ind/>
+        <w:rPr>
+          <w:highlight w:val="none"/>
+        </w:rPr>
+      </w:pPr>
+      <w:r>
+        <w:rPr>
+          <w:highlight w:val="none"/>
+        </w:rPr>
+      </w:r>
+      <w:r>
+        <w:rPr>
+          <w:highlight w:val="none"/>
+        </w:rPr>
+      </w:r>
+      <w:r>
+        <w:rPr>
+          <w:highlight w:val="none"/>
+        </w:rPr>
+      </w:r>
+    </w:p>
+    <w:p>
+      <w:pPr>
+        <w:pBdr/>
+        <w:spacing/>
+        <w:ind/>
+        <w:rPr>
+          <w:highlight w:val="none"/>
         </w:rPr>
       </w:pPr>
       <w:r>
@@ -1305,7 +1524,7 @@
           <w:szCs w:val="28"/>
           <w:u w:val="single"/>
         </w:rPr>
-        <w:t xml:space="preserve">Step 9 Output:</w:t>
+        <w:t xml:space="preserve">Step 10 Output:</w:t>
       </w:r>
       <w:r>
         <w:rPr>
@@ -1336,6 +1555,83 @@
           <w:u w:val="single"/>
         </w:rPr>
       </w:pPr>
+      <w:r>
+        <w:rPr>
+          <w:sz w:val="28"/>
+          <w:szCs w:val="28"/>
+          <w:highlight w:val="none"/>
+          <w:u w:val="single"/>
+        </w:rPr>
+      </w:r>
+      <w:r>
+        <mc:AlternateContent>
+          <mc:Choice Requires="wpg">
+            <w:drawing>
+              <wp:inline xmlns:wp="http://schemas.openxmlformats.org/drawingml/2006/wordprocessingDrawing" distT="0" distB="0" distL="0" distR="0">
+                <wp:extent cx="4171950" cy="1123950"/>
+                <wp:effectExtent l="0" t="0" r="0" b="0"/>
+                <wp:docPr id="10" name=""/>
+                <wp:cNvGraphicFramePr>
+                  <a:graphicFrameLocks xmlns:a="http://schemas.openxmlformats.org/drawingml/2006/main" noChangeAspect="1"/>
+                </wp:cNvGraphicFramePr>
+                <a:graphic xmlns:a="http://schemas.openxmlformats.org/drawingml/2006/main">
+                  <a:graphicData uri="http://schemas.openxmlformats.org/drawingml/2006/picture">
+                    <pic:pic xmlns:pic="http://schemas.openxmlformats.org/drawingml/2006/picture">
+                      <pic:nvPicPr>
+                        <pic:cNvPr id="314412809" name=""/>
+                        <pic:cNvPicPr>
+                          <a:picLocks noChangeAspect="1"/>
+                        </pic:cNvPicPr>
+                        <pic:nvPr/>
+                      </pic:nvPicPr>
+                      <pic:blipFill rotWithShape="1">
+                        <a:blip r:embed="rId17"/>
+                        <a:stretch/>
+                      </pic:blipFill>
+                      <pic:spPr bwMode="auto">
+                        <a:xfrm>
+                          <a:off x="0" y="0"/>
+                          <a:ext cx="4171950" cy="1123949"/>
+                        </a:xfrm>
+                        <a:prstGeom prst="rect">
+                          <a:avLst/>
+                        </a:prstGeom>
+                      </pic:spPr>
+                    </pic:pic>
+                  </a:graphicData>
+                </a:graphic>
+              </wp:inline>
+            </w:drawing>
+          </mc:Choice>
+          <mc:Fallback>
+            <w:pict>
+              <v:shapetype id="_x0000_t75" coordsize="21600,21600" o:spt="75" o:preferrelative="t" path="m@4@5l@4@11@9@11@9@5xe" filled="f" stroked="f">
+                <v:stroke joinstyle="miter"/>
+                <v:formulas>
+                  <v:f eqn="if lineDrawn pixelLineWidth 0"/>
+                  <v:f eqn="sum @0 1 0"/>
+                  <v:f eqn="sum 0 0 @1"/>
+                  <v:f eqn="prod @2 1 2"/>
+                  <v:f eqn="prod @3 21600 pixelWidth"/>
+                  <v:f eqn="prod @3 21600 pixelHeight"/>
+                  <v:f eqn="sum @0 0 1"/>
+                  <v:f eqn="prod @6 1 2"/>
+                  <v:f eqn="prod @7 21600 pixelWidth"/>
+                  <v:f eqn="sum @8 21600 0"/>
+                  <v:f eqn="prod @7 21600 pixelHeight"/>
+                  <v:f eqn="sum @10 21600 0"/>
+                </v:formulas>
+                <v:path o:extrusionok="f" gradientshapeok="t" o:connecttype="rect"/>
+                <o:lock v:ext="edit" aspectratio="t"/>
+              </v:shapetype>
+              <v:shape id="_x0000_i9" o:spid="_x0000_s9" type="#_x0000_t75" style="width:328.50pt;height:88.50pt;mso-wrap-distance-left:0.00pt;mso-wrap-distance-top:0.00pt;mso-wrap-distance-right:0.00pt;mso-wrap-distance-bottom:0.00pt;z-index:1;" stroked="false">
+                <v:imagedata r:id="rId17" o:title=""/>
+                <o:lock v:ext="edit" rotation="t"/>
+              </v:shape>
+            </w:pict>
+          </mc:Fallback>
+        </mc:AlternateContent>
+      </w:r>
       <w:r>
         <w:rPr>
           <w:sz w:val="28"/>
@@ -1369,80 +1665,6 @@
         <w:rPr>
           <w:sz w:val="28"/>
           <w:szCs w:val="28"/>
-          <w:highlight w:val="none"/>
-          <w:u w:val="single"/>
-        </w:rPr>
-      </w:pPr>
-      <w:r>
-        <w:rPr>
-          <w:sz w:val="28"/>
-          <w:szCs w:val="28"/>
-          <w:u w:val="single"/>
-        </w:rPr>
-        <w:t xml:space="preserve">Step 10 Output:</w:t>
-      </w:r>
-      <w:r>
-        <w:rPr>
-          <w:sz w:val="28"/>
-          <w:szCs w:val="28"/>
-          <w:highlight w:val="none"/>
-          <w:u w:val="single"/>
-        </w:rPr>
-      </w:r>
-      <w:r>
-        <w:rPr>
-          <w:sz w:val="28"/>
-          <w:szCs w:val="28"/>
-          <w:highlight w:val="none"/>
-          <w:u w:val="single"/>
-        </w:rPr>
-      </w:r>
-    </w:p>
-    <w:p>
-      <w:pPr>
-        <w:pBdr/>
-        <w:spacing/>
-        <w:ind/>
-        <w:rPr>
-          <w:sz w:val="28"/>
-          <w:szCs w:val="28"/>
-          <w:highlight w:val="none"/>
-          <w:u w:val="single"/>
-        </w:rPr>
-      </w:pPr>
-      <w:r>
-        <w:rPr>
-          <w:sz w:val="28"/>
-          <w:szCs w:val="28"/>
-          <w:highlight w:val="none"/>
-          <w:u w:val="single"/>
-        </w:rPr>
-      </w:r>
-      <w:r>
-        <w:rPr>
-          <w:sz w:val="28"/>
-          <w:szCs w:val="28"/>
-          <w:highlight w:val="none"/>
-          <w:u w:val="single"/>
-        </w:rPr>
-      </w:r>
-      <w:r>
-        <w:rPr>
-          <w:sz w:val="28"/>
-          <w:szCs w:val="28"/>
-          <w:highlight w:val="none"/>
-          <w:u w:val="single"/>
-        </w:rPr>
-      </w:r>
-    </w:p>
-    <w:p>
-      <w:pPr>
-        <w:pBdr/>
-        <w:spacing/>
-        <w:ind/>
-        <w:rPr>
-          <w:sz w:val="28"/>
-          <w:szCs w:val="28"/>
         </w:rPr>
       </w:pPr>
       <w:r>
@@ -1463,7 +1685,6 @@
         <w:rPr>
           <w:sz w:val="28"/>
           <w:szCs w:val="28"/>
-          <w:highlight w:val="none"/>
         </w:rPr>
       </w:r>
     </w:p>
@@ -1489,7 +1710,6 @@
         <w:ind/>
         <w:rPr/>
       </w:pPr>
-      <w:r/>
       <w:r>
         <w:separator/>
       </w:r>
@@ -1504,7 +1724,6 @@
         <w:ind/>
         <w:rPr/>
       </w:pPr>
-      <w:r/>
       <w:r>
         <w:continuationSeparator/>
       </w:r>
@@ -1524,7 +1743,6 @@
         <w:ind/>
         <w:rPr/>
       </w:pPr>
-      <w:r/>
       <w:r>
         <w:separator/>
       </w:r>
@@ -1539,7 +1757,6 @@
         <w:ind/>
         <w:rPr/>
       </w:pPr>
-      <w:r/>
       <w:r>
         <w:continuationSeparator/>
       </w:r>
@@ -1707,9 +1924,9 @@
     <w:lsdException w:name="Bibliography" w:uiPriority="37"/>
     <w:lsdException w:name="TOC Heading" w:uiPriority="39" w:qFormat="1"/>
   </w:latentStyles>
-  <w:style w:type="table" w:styleId="12">
+  <w:style w:type="table" w:styleId="701">
     <w:name w:val="Table Grid"/>
-    <w:basedOn w:val="665"/>
+    <w:basedOn w:val="887"/>
     <w:uiPriority w:val="59"/>
     <w:pPr>
       <w:pBdr/>
@@ -1906,9 +2123,9 @@
       </w:tcPr>
     </w:tblStylePr>
   </w:style>
-  <w:style w:type="table" w:styleId="13">
+  <w:style w:type="table" w:styleId="702">
     <w:name w:val="Table Grid Light"/>
-    <w:basedOn w:val="665"/>
+    <w:basedOn w:val="887"/>
     <w:uiPriority w:val="59"/>
     <w:pPr>
       <w:pBdr/>
@@ -2105,9 +2322,9 @@
       </w:tcPr>
     </w:tblStylePr>
   </w:style>
-  <w:style w:type="table" w:styleId="14">
+  <w:style w:type="table" w:styleId="703">
     <w:name w:val="Plain Table 1"/>
-    <w:basedOn w:val="665"/>
+    <w:basedOn w:val="887"/>
     <w:uiPriority w:val="59"/>
     <w:pPr>
       <w:pBdr/>
@@ -2330,9 +2547,9 @@
       </w:tcPr>
     </w:tblStylePr>
   </w:style>
-  <w:style w:type="table" w:styleId="15">
+  <w:style w:type="table" w:styleId="704">
     <w:name w:val="Plain Table 2"/>
-    <w:basedOn w:val="665"/>
+    <w:basedOn w:val="887"/>
     <w:uiPriority w:val="59"/>
     <w:pPr>
       <w:pBdr/>
@@ -2563,9 +2780,9 @@
       </w:tcPr>
     </w:tblStylePr>
   </w:style>
-  <w:style w:type="table" w:styleId="16">
+  <w:style w:type="table" w:styleId="705">
     <w:name w:val="Plain Table 3"/>
-    <w:basedOn w:val="665"/>
+    <w:basedOn w:val="887"/>
     <w:uiPriority w:val="99"/>
     <w:pPr>
       <w:pBdr/>
@@ -2793,9 +3010,9 @@
       </w:tcPr>
     </w:tblStylePr>
   </w:style>
-  <w:style w:type="table" w:styleId="17">
+  <w:style w:type="table" w:styleId="706">
     <w:name w:val="Plain Table 4"/>
-    <w:basedOn w:val="665"/>
+    <w:basedOn w:val="887"/>
     <w:uiPriority w:val="99"/>
     <w:pPr>
       <w:pBdr/>
@@ -3009,9 +3226,9 @@
       </w:tcPr>
     </w:tblStylePr>
   </w:style>
-  <w:style w:type="table" w:styleId="18">
+  <w:style w:type="table" w:styleId="707">
     <w:name w:val="Plain Table 5"/>
-    <w:basedOn w:val="665"/>
+    <w:basedOn w:val="887"/>
     <w:uiPriority w:val="99"/>
     <w:pPr>
       <w:pBdr/>
@@ -3242,9 +3459,9 @@
       </w:tcPr>
     </w:tblStylePr>
   </w:style>
-  <w:style w:type="table" w:styleId="19">
+  <w:style w:type="table" w:styleId="708">
     <w:name w:val="Grid Table 1 Light"/>
-    <w:basedOn w:val="665"/>
+    <w:basedOn w:val="887"/>
     <w:uiPriority w:val="99"/>
     <w:pPr>
       <w:pBdr/>
@@ -3465,9 +3682,9 @@
       </w:tcPr>
     </w:tblStylePr>
   </w:style>
-  <w:style w:type="table" w:styleId="20">
+  <w:style w:type="table" w:styleId="709">
     <w:name w:val="Grid Table 1 Light - Accent 1"/>
-    <w:basedOn w:val="665"/>
+    <w:basedOn w:val="887"/>
     <w:uiPriority w:val="99"/>
     <w:pPr>
       <w:pBdr/>
@@ -3688,9 +3905,9 @@
       </w:tcPr>
     </w:tblStylePr>
   </w:style>
-  <w:style w:type="table" w:styleId="21">
+  <w:style w:type="table" w:styleId="710">
     <w:name w:val="Grid Table 1 Light - Accent 2"/>
-    <w:basedOn w:val="665"/>
+    <w:basedOn w:val="887"/>
     <w:uiPriority w:val="99"/>
     <w:pPr>
       <w:pBdr/>
@@ -3911,9 +4128,9 @@
       </w:tcPr>
     </w:tblStylePr>
   </w:style>
-  <w:style w:type="table" w:styleId="22">
+  <w:style w:type="table" w:styleId="711">
     <w:name w:val="Grid Table 1 Light - Accent 3"/>
-    <w:basedOn w:val="665"/>
+    <w:basedOn w:val="887"/>
     <w:uiPriority w:val="99"/>
     <w:pPr>
       <w:pBdr/>
@@ -4134,9 +4351,9 @@
       </w:tcPr>
     </w:tblStylePr>
   </w:style>
-  <w:style w:type="table" w:styleId="23">
+  <w:style w:type="table" w:styleId="712">
     <w:name w:val="Grid Table 1 Light - Accent 4"/>
-    <w:basedOn w:val="665"/>
+    <w:basedOn w:val="887"/>
     <w:uiPriority w:val="99"/>
     <w:pPr>
       <w:pBdr/>
@@ -4357,9 +4574,9 @@
       </w:tcPr>
     </w:tblStylePr>
   </w:style>
-  <w:style w:type="table" w:styleId="24">
+  <w:style w:type="table" w:styleId="713">
     <w:name w:val="Grid Table 1 Light - Accent 5"/>
-    <w:basedOn w:val="665"/>
+    <w:basedOn w:val="887"/>
     <w:uiPriority w:val="99"/>
     <w:pPr>
       <w:pBdr/>
@@ -4580,9 +4797,9 @@
       </w:tcPr>
     </w:tblStylePr>
   </w:style>
-  <w:style w:type="table" w:styleId="25">
+  <w:style w:type="table" w:styleId="714">
     <w:name w:val="Grid Table 1 Light - Accent 6"/>
-    <w:basedOn w:val="665"/>
+    <w:basedOn w:val="887"/>
     <w:uiPriority w:val="99"/>
     <w:pPr>
       <w:pBdr/>
@@ -4803,9 +5020,9 @@
       </w:tcPr>
     </w:tblStylePr>
   </w:style>
-  <w:style w:type="table" w:styleId="26">
+  <w:style w:type="table" w:styleId="715">
     <w:name w:val="Grid Table 2"/>
-    <w:basedOn w:val="665"/>
+    <w:basedOn w:val="887"/>
     <w:uiPriority w:val="99"/>
     <w:pPr>
       <w:pBdr/>
@@ -5035,9 +5252,9 @@
       </w:tcPr>
     </w:tblStylePr>
   </w:style>
-  <w:style w:type="table" w:styleId="27">
+  <w:style w:type="table" w:styleId="716">
     <w:name w:val="Grid Table 2 - Accent 1"/>
-    <w:basedOn w:val="665"/>
+    <w:basedOn w:val="887"/>
     <w:uiPriority w:val="99"/>
     <w:pPr>
       <w:pBdr/>
@@ -5267,9 +5484,9 @@
       </w:tcPr>
     </w:tblStylePr>
   </w:style>
-  <w:style w:type="table" w:styleId="28">
+  <w:style w:type="table" w:styleId="717">
     <w:name w:val="Grid Table 2 - Accent 2"/>
-    <w:basedOn w:val="665"/>
+    <w:basedOn w:val="887"/>
     <w:uiPriority w:val="99"/>
     <w:pPr>
       <w:pBdr/>
@@ -5499,9 +5716,9 @@
       </w:tcPr>
     </w:tblStylePr>
   </w:style>
-  <w:style w:type="table" w:styleId="29">
+  <w:style w:type="table" w:styleId="718">
     <w:name w:val="Grid Table 2 - Accent 3"/>
-    <w:basedOn w:val="665"/>
+    <w:basedOn w:val="887"/>
     <w:uiPriority w:val="99"/>
     <w:pPr>
       <w:pBdr/>
@@ -5731,9 +5948,9 @@
       </w:tcPr>
     </w:tblStylePr>
   </w:style>
-  <w:style w:type="table" w:styleId="30">
+  <w:style w:type="table" w:styleId="719">
     <w:name w:val="Grid Table 2 - Accent 4"/>
-    <w:basedOn w:val="665"/>
+    <w:basedOn w:val="887"/>
     <w:uiPriority w:val="99"/>
     <w:pPr>
       <w:pBdr/>
@@ -5963,9 +6180,9 @@
       </w:tcPr>
     </w:tblStylePr>
   </w:style>
-  <w:style w:type="table" w:styleId="31">
+  <w:style w:type="table" w:styleId="720">
     <w:name w:val="Grid Table 2 - Accent 5"/>
-    <w:basedOn w:val="665"/>
+    <w:basedOn w:val="887"/>
     <w:uiPriority w:val="99"/>
     <w:pPr>
       <w:pBdr/>
@@ -6195,9 +6412,9 @@
       </w:tcPr>
     </w:tblStylePr>
   </w:style>
-  <w:style w:type="table" w:styleId="32">
+  <w:style w:type="table" w:styleId="721">
     <w:name w:val="Grid Table 2 - Accent 6"/>
-    <w:basedOn w:val="665"/>
+    <w:basedOn w:val="887"/>
     <w:uiPriority w:val="99"/>
     <w:pPr>
       <w:pBdr/>
@@ -6427,9 +6644,9 @@
       </w:tcPr>
     </w:tblStylePr>
   </w:style>
-  <w:style w:type="table" w:styleId="33">
+  <w:style w:type="table" w:styleId="722">
     <w:name w:val="Grid Table 3"/>
-    <w:basedOn w:val="665"/>
+    <w:basedOn w:val="887"/>
     <w:uiPriority w:val="99"/>
     <w:pPr>
       <w:pBdr/>
@@ -6528,29 +6745,6 @@
         <w:tblBorders/>
       </w:tblPr>
       <w:tcPr>
-        <w:shd w:color="ffffff"/>
-        <w:tcBorders>
-          <w:top w:val="none" w:color="000000" w:sz="4" w:space="0"/>
-          <w:left w:val="none" w:color="000000" w:sz="4" w:space="0"/>
-          <w:bottom w:val="none" w:color="000000" w:sz="4" w:space="0"/>
-          <w:right w:val="none" w:color="000000" w:sz="4" w:space="0"/>
-        </w:tcBorders>
-      </w:tcPr>
-    </w:tblStylePr>
-    <w:tblStylePr w:type="firstRow">
-      <w:rPr>
-        <w:b/>
-        <w:color w:val="404040"/>
-      </w:rPr>
-      <w:pPr>
-        <w:pBdr/>
-        <w:spacing/>
-        <w:ind/>
-      </w:pPr>
-      <w:tblPr>
-        <w:tblBorders/>
-      </w:tblPr>
-      <w:tcPr>
         <w:shd w:val="clear" w:color="ffffff"/>
         <w:tcBorders>
           <w:top w:val="none" w:color="000000" w:sz="4" w:space="0"/>
@@ -6560,30 +6754,7 @@
         </w:tcBorders>
       </w:tcPr>
     </w:tblStylePr>
-    <w:tblStylePr w:type="lastCol">
-      <w:rPr>
-        <w:i/>
-        <w:color w:val="404040"/>
-      </w:rPr>
-      <w:pPr>
-        <w:pBdr/>
-        <w:spacing/>
-        <w:ind/>
-      </w:pPr>
-      <w:tblPr>
-        <w:tblBorders/>
-      </w:tblPr>
-      <w:tcPr>
-        <w:shd w:color="ffffff"/>
-        <w:tcBorders>
-          <w:top w:val="none" w:color="000000" w:sz="4" w:space="0"/>
-          <w:left w:val="none" w:color="000000" w:sz="4" w:space="0"/>
-          <w:bottom w:val="none" w:color="000000" w:sz="4" w:space="0"/>
-          <w:right w:val="none" w:color="000000" w:sz="4" w:space="0"/>
-        </w:tcBorders>
-      </w:tcPr>
-    </w:tblStylePr>
-    <w:tblStylePr w:type="lastRow">
+    <w:tblStylePr w:type="firstRow">
       <w:rPr>
         <w:b/>
         <w:color w:val="404040"/>
@@ -6606,6 +6777,52 @@
         </w:tcBorders>
       </w:tcPr>
     </w:tblStylePr>
+    <w:tblStylePr w:type="lastCol">
+      <w:rPr>
+        <w:i/>
+        <w:color w:val="404040"/>
+      </w:rPr>
+      <w:pPr>
+        <w:pBdr/>
+        <w:spacing/>
+        <w:ind/>
+      </w:pPr>
+      <w:tblPr>
+        <w:tblBorders/>
+      </w:tblPr>
+      <w:tcPr>
+        <w:shd w:val="clear" w:color="ffffff"/>
+        <w:tcBorders>
+          <w:top w:val="none" w:color="000000" w:sz="4" w:space="0"/>
+          <w:left w:val="none" w:color="000000" w:sz="4" w:space="0"/>
+          <w:bottom w:val="none" w:color="000000" w:sz="4" w:space="0"/>
+          <w:right w:val="none" w:color="000000" w:sz="4" w:space="0"/>
+        </w:tcBorders>
+      </w:tcPr>
+    </w:tblStylePr>
+    <w:tblStylePr w:type="lastRow">
+      <w:rPr>
+        <w:b/>
+        <w:color w:val="404040"/>
+      </w:rPr>
+      <w:pPr>
+        <w:pBdr/>
+        <w:spacing/>
+        <w:ind/>
+      </w:pPr>
+      <w:tblPr>
+        <w:tblBorders/>
+      </w:tblPr>
+      <w:tcPr>
+        <w:shd w:val="clear" w:color="ffffff"/>
+        <w:tcBorders>
+          <w:top w:val="none" w:color="000000" w:sz="4" w:space="0"/>
+          <w:left w:val="none" w:color="000000" w:sz="4" w:space="0"/>
+          <w:bottom w:val="none" w:color="000000" w:sz="4" w:space="0"/>
+          <w:right w:val="none" w:color="000000" w:sz="4" w:space="0"/>
+        </w:tcBorders>
+      </w:tcPr>
+    </w:tblStylePr>
     <w:tblStylePr w:type="nwCell">
       <w:pPr>
         <w:pBdr/>
@@ -6672,9 +6889,9 @@
       </w:tcPr>
     </w:tblStylePr>
   </w:style>
-  <w:style w:type="table" w:styleId="34">
+  <w:style w:type="table" w:styleId="723">
     <w:name w:val="Grid Table 3 - Accent 1"/>
-    <w:basedOn w:val="665"/>
+    <w:basedOn w:val="887"/>
     <w:uiPriority w:val="99"/>
     <w:pPr>
       <w:pBdr/>
@@ -6773,29 +6990,6 @@
         <w:tblBorders/>
       </w:tblPr>
       <w:tcPr>
-        <w:shd w:color="ffffff"/>
-        <w:tcBorders>
-          <w:top w:val="none" w:color="000000" w:sz="4" w:space="0"/>
-          <w:left w:val="none" w:color="000000" w:sz="4" w:space="0"/>
-          <w:bottom w:val="none" w:color="000000" w:sz="4" w:space="0"/>
-          <w:right w:val="none" w:color="000000" w:sz="4" w:space="0"/>
-        </w:tcBorders>
-      </w:tcPr>
-    </w:tblStylePr>
-    <w:tblStylePr w:type="firstRow">
-      <w:rPr>
-        <w:b/>
-        <w:color w:val="404040"/>
-      </w:rPr>
-      <w:pPr>
-        <w:pBdr/>
-        <w:spacing/>
-        <w:ind/>
-      </w:pPr>
-      <w:tblPr>
-        <w:tblBorders/>
-      </w:tblPr>
-      <w:tcPr>
         <w:shd w:val="clear" w:color="ffffff"/>
         <w:tcBorders>
           <w:top w:val="none" w:color="000000" w:sz="4" w:space="0"/>
@@ -6805,30 +6999,7 @@
         </w:tcBorders>
       </w:tcPr>
     </w:tblStylePr>
-    <w:tblStylePr w:type="lastCol">
-      <w:rPr>
-        <w:i/>
-        <w:color w:val="404040"/>
-      </w:rPr>
-      <w:pPr>
-        <w:pBdr/>
-        <w:spacing/>
-        <w:ind/>
-      </w:pPr>
-      <w:tblPr>
-        <w:tblBorders/>
-      </w:tblPr>
-      <w:tcPr>
-        <w:shd w:color="ffffff"/>
-        <w:tcBorders>
-          <w:top w:val="none" w:color="000000" w:sz="4" w:space="0"/>
-          <w:left w:val="none" w:color="000000" w:sz="4" w:space="0"/>
-          <w:bottom w:val="none" w:color="000000" w:sz="4" w:space="0"/>
-          <w:right w:val="none" w:color="000000" w:sz="4" w:space="0"/>
-        </w:tcBorders>
-      </w:tcPr>
-    </w:tblStylePr>
-    <w:tblStylePr w:type="lastRow">
+    <w:tblStylePr w:type="firstRow">
       <w:rPr>
         <w:b/>
         <w:color w:val="404040"/>
@@ -6851,6 +7022,52 @@
         </w:tcBorders>
       </w:tcPr>
     </w:tblStylePr>
+    <w:tblStylePr w:type="lastCol">
+      <w:rPr>
+        <w:i/>
+        <w:color w:val="404040"/>
+      </w:rPr>
+      <w:pPr>
+        <w:pBdr/>
+        <w:spacing/>
+        <w:ind/>
+      </w:pPr>
+      <w:tblPr>
+        <w:tblBorders/>
+      </w:tblPr>
+      <w:tcPr>
+        <w:shd w:val="clear" w:color="ffffff"/>
+        <w:tcBorders>
+          <w:top w:val="none" w:color="000000" w:sz="4" w:space="0"/>
+          <w:left w:val="none" w:color="000000" w:sz="4" w:space="0"/>
+          <w:bottom w:val="none" w:color="000000" w:sz="4" w:space="0"/>
+          <w:right w:val="none" w:color="000000" w:sz="4" w:space="0"/>
+        </w:tcBorders>
+      </w:tcPr>
+    </w:tblStylePr>
+    <w:tblStylePr w:type="lastRow">
+      <w:rPr>
+        <w:b/>
+        <w:color w:val="404040"/>
+      </w:rPr>
+      <w:pPr>
+        <w:pBdr/>
+        <w:spacing/>
+        <w:ind/>
+      </w:pPr>
+      <w:tblPr>
+        <w:tblBorders/>
+      </w:tblPr>
+      <w:tcPr>
+        <w:shd w:val="clear" w:color="ffffff"/>
+        <w:tcBorders>
+          <w:top w:val="none" w:color="000000" w:sz="4" w:space="0"/>
+          <w:left w:val="none" w:color="000000" w:sz="4" w:space="0"/>
+          <w:bottom w:val="none" w:color="000000" w:sz="4" w:space="0"/>
+          <w:right w:val="none" w:color="000000" w:sz="4" w:space="0"/>
+        </w:tcBorders>
+      </w:tcPr>
+    </w:tblStylePr>
     <w:tblStylePr w:type="nwCell">
       <w:pPr>
         <w:pBdr/>
@@ -6917,9 +7134,9 @@
       </w:tcPr>
     </w:tblStylePr>
   </w:style>
-  <w:style w:type="table" w:styleId="35">
+  <w:style w:type="table" w:styleId="724">
     <w:name w:val="Grid Table 3 - Accent 2"/>
-    <w:basedOn w:val="665"/>
+    <w:basedOn w:val="887"/>
     <w:uiPriority w:val="99"/>
     <w:pPr>
       <w:pBdr/>
@@ -7018,29 +7235,6 @@
         <w:tblBorders/>
       </w:tblPr>
       <w:tcPr>
-        <w:shd w:color="ffffff"/>
-        <w:tcBorders>
-          <w:top w:val="none" w:color="000000" w:sz="4" w:space="0"/>
-          <w:left w:val="none" w:color="000000" w:sz="4" w:space="0"/>
-          <w:bottom w:val="none" w:color="000000" w:sz="4" w:space="0"/>
-          <w:right w:val="none" w:color="000000" w:sz="4" w:space="0"/>
-        </w:tcBorders>
-      </w:tcPr>
-    </w:tblStylePr>
-    <w:tblStylePr w:type="firstRow">
-      <w:rPr>
-        <w:b/>
-        <w:color w:val="404040"/>
-      </w:rPr>
-      <w:pPr>
-        <w:pBdr/>
-        <w:spacing/>
-        <w:ind/>
-      </w:pPr>
-      <w:tblPr>
-        <w:tblBorders/>
-      </w:tblPr>
-      <w:tcPr>
         <w:shd w:val="clear" w:color="ffffff"/>
         <w:tcBorders>
           <w:top w:val="none" w:color="000000" w:sz="4" w:space="0"/>
@@ -7050,30 +7244,7 @@
         </w:tcBorders>
       </w:tcPr>
     </w:tblStylePr>
-    <w:tblStylePr w:type="lastCol">
-      <w:rPr>
-        <w:i/>
-        <w:color w:val="404040"/>
-      </w:rPr>
-      <w:pPr>
-        <w:pBdr/>
-        <w:spacing/>
-        <w:ind/>
-      </w:pPr>
-      <w:tblPr>
-        <w:tblBorders/>
-      </w:tblPr>
-      <w:tcPr>
-        <w:shd w:color="ffffff"/>
-        <w:tcBorders>
-          <w:top w:val="none" w:color="000000" w:sz="4" w:space="0"/>
-          <w:left w:val="none" w:color="000000" w:sz="4" w:space="0"/>
-          <w:bottom w:val="none" w:color="000000" w:sz="4" w:space="0"/>
-          <w:right w:val="none" w:color="000000" w:sz="4" w:space="0"/>
-        </w:tcBorders>
-      </w:tcPr>
-    </w:tblStylePr>
-    <w:tblStylePr w:type="lastRow">
+    <w:tblStylePr w:type="firstRow">
       <w:rPr>
         <w:b/>
         <w:color w:val="404040"/>
@@ -7096,6 +7267,52 @@
         </w:tcBorders>
       </w:tcPr>
     </w:tblStylePr>
+    <w:tblStylePr w:type="lastCol">
+      <w:rPr>
+        <w:i/>
+        <w:color w:val="404040"/>
+      </w:rPr>
+      <w:pPr>
+        <w:pBdr/>
+        <w:spacing/>
+        <w:ind/>
+      </w:pPr>
+      <w:tblPr>
+        <w:tblBorders/>
+      </w:tblPr>
+      <w:tcPr>
+        <w:shd w:val="clear" w:color="ffffff"/>
+        <w:tcBorders>
+          <w:top w:val="none" w:color="000000" w:sz="4" w:space="0"/>
+          <w:left w:val="none" w:color="000000" w:sz="4" w:space="0"/>
+          <w:bottom w:val="none" w:color="000000" w:sz="4" w:space="0"/>
+          <w:right w:val="none" w:color="000000" w:sz="4" w:space="0"/>
+        </w:tcBorders>
+      </w:tcPr>
+    </w:tblStylePr>
+    <w:tblStylePr w:type="lastRow">
+      <w:rPr>
+        <w:b/>
+        <w:color w:val="404040"/>
+      </w:rPr>
+      <w:pPr>
+        <w:pBdr/>
+        <w:spacing/>
+        <w:ind/>
+      </w:pPr>
+      <w:tblPr>
+        <w:tblBorders/>
+      </w:tblPr>
+      <w:tcPr>
+        <w:shd w:val="clear" w:color="ffffff"/>
+        <w:tcBorders>
+          <w:top w:val="none" w:color="000000" w:sz="4" w:space="0"/>
+          <w:left w:val="none" w:color="000000" w:sz="4" w:space="0"/>
+          <w:bottom w:val="none" w:color="000000" w:sz="4" w:space="0"/>
+          <w:right w:val="none" w:color="000000" w:sz="4" w:space="0"/>
+        </w:tcBorders>
+      </w:tcPr>
+    </w:tblStylePr>
     <w:tblStylePr w:type="nwCell">
       <w:pPr>
         <w:pBdr/>
@@ -7162,9 +7379,9 @@
       </w:tcPr>
     </w:tblStylePr>
   </w:style>
-  <w:style w:type="table" w:styleId="36">
+  <w:style w:type="table" w:styleId="725">
     <w:name w:val="Grid Table 3 - Accent 3"/>
-    <w:basedOn w:val="665"/>
+    <w:basedOn w:val="887"/>
     <w:uiPriority w:val="99"/>
     <w:pPr>
       <w:pBdr/>
@@ -7263,29 +7480,6 @@
         <w:tblBorders/>
       </w:tblPr>
       <w:tcPr>
-        <w:shd w:color="ffffff"/>
-        <w:tcBorders>
-          <w:top w:val="none" w:color="000000" w:sz="4" w:space="0"/>
-          <w:left w:val="none" w:color="000000" w:sz="4" w:space="0"/>
-          <w:bottom w:val="none" w:color="000000" w:sz="4" w:space="0"/>
-          <w:right w:val="none" w:color="000000" w:sz="4" w:space="0"/>
-        </w:tcBorders>
-      </w:tcPr>
-    </w:tblStylePr>
-    <w:tblStylePr w:type="firstRow">
-      <w:rPr>
-        <w:b/>
-        <w:color w:val="404040"/>
-      </w:rPr>
-      <w:pPr>
-        <w:pBdr/>
-        <w:spacing/>
-        <w:ind/>
-      </w:pPr>
-      <w:tblPr>
-        <w:tblBorders/>
-      </w:tblPr>
-      <w:tcPr>
         <w:shd w:val="clear" w:color="ffffff"/>
         <w:tcBorders>
           <w:top w:val="none" w:color="000000" w:sz="4" w:space="0"/>
@@ -7295,30 +7489,7 @@
         </w:tcBorders>
       </w:tcPr>
     </w:tblStylePr>
-    <w:tblStylePr w:type="lastCol">
-      <w:rPr>
-        <w:i/>
-        <w:color w:val="404040"/>
-      </w:rPr>
-      <w:pPr>
-        <w:pBdr/>
-        <w:spacing/>
-        <w:ind/>
-      </w:pPr>
-      <w:tblPr>
-        <w:tblBorders/>
-      </w:tblPr>
-      <w:tcPr>
-        <w:shd w:color="ffffff"/>
-        <w:tcBorders>
-          <w:top w:val="none" w:color="000000" w:sz="4" w:space="0"/>
-          <w:left w:val="none" w:color="000000" w:sz="4" w:space="0"/>
-          <w:bottom w:val="none" w:color="000000" w:sz="4" w:space="0"/>
-          <w:right w:val="none" w:color="000000" w:sz="4" w:space="0"/>
-        </w:tcBorders>
-      </w:tcPr>
-    </w:tblStylePr>
-    <w:tblStylePr w:type="lastRow">
+    <w:tblStylePr w:type="firstRow">
       <w:rPr>
         <w:b/>
         <w:color w:val="404040"/>
@@ -7341,6 +7512,52 @@
         </w:tcBorders>
       </w:tcPr>
     </w:tblStylePr>
+    <w:tblStylePr w:type="lastCol">
+      <w:rPr>
+        <w:i/>
+        <w:color w:val="404040"/>
+      </w:rPr>
+      <w:pPr>
+        <w:pBdr/>
+        <w:spacing/>
+        <w:ind/>
+      </w:pPr>
+      <w:tblPr>
+        <w:tblBorders/>
+      </w:tblPr>
+      <w:tcPr>
+        <w:shd w:val="clear" w:color="ffffff"/>
+        <w:tcBorders>
+          <w:top w:val="none" w:color="000000" w:sz="4" w:space="0"/>
+          <w:left w:val="none" w:color="000000" w:sz="4" w:space="0"/>
+          <w:bottom w:val="none" w:color="000000" w:sz="4" w:space="0"/>
+          <w:right w:val="none" w:color="000000" w:sz="4" w:space="0"/>
+        </w:tcBorders>
+      </w:tcPr>
+    </w:tblStylePr>
+    <w:tblStylePr w:type="lastRow">
+      <w:rPr>
+        <w:b/>
+        <w:color w:val="404040"/>
+      </w:rPr>
+      <w:pPr>
+        <w:pBdr/>
+        <w:spacing/>
+        <w:ind/>
+      </w:pPr>
+      <w:tblPr>
+        <w:tblBorders/>
+      </w:tblPr>
+      <w:tcPr>
+        <w:shd w:val="clear" w:color="ffffff"/>
+        <w:tcBorders>
+          <w:top w:val="none" w:color="000000" w:sz="4" w:space="0"/>
+          <w:left w:val="none" w:color="000000" w:sz="4" w:space="0"/>
+          <w:bottom w:val="none" w:color="000000" w:sz="4" w:space="0"/>
+          <w:right w:val="none" w:color="000000" w:sz="4" w:space="0"/>
+        </w:tcBorders>
+      </w:tcPr>
+    </w:tblStylePr>
     <w:tblStylePr w:type="nwCell">
       <w:pPr>
         <w:pBdr/>
@@ -7407,9 +7624,9 @@
       </w:tcPr>
     </w:tblStylePr>
   </w:style>
-  <w:style w:type="table" w:styleId="37">
+  <w:style w:type="table" w:styleId="726">
     <w:name w:val="Grid Table 3 - Accent 4"/>
-    <w:basedOn w:val="665"/>
+    <w:basedOn w:val="887"/>
     <w:uiPriority w:val="99"/>
     <w:pPr>
       <w:pBdr/>
@@ -7508,29 +7725,6 @@
         <w:tblBorders/>
       </w:tblPr>
       <w:tcPr>
-        <w:shd w:color="ffffff"/>
-        <w:tcBorders>
-          <w:top w:val="none" w:color="000000" w:sz="4" w:space="0"/>
-          <w:left w:val="none" w:color="000000" w:sz="4" w:space="0"/>
-          <w:bottom w:val="none" w:color="000000" w:sz="4" w:space="0"/>
-          <w:right w:val="none" w:color="000000" w:sz="4" w:space="0"/>
-        </w:tcBorders>
-      </w:tcPr>
-    </w:tblStylePr>
-    <w:tblStylePr w:type="firstRow">
-      <w:rPr>
-        <w:b/>
-        <w:color w:val="404040"/>
-      </w:rPr>
-      <w:pPr>
-        <w:pBdr/>
-        <w:spacing/>
-        <w:ind/>
-      </w:pPr>
-      <w:tblPr>
-        <w:tblBorders/>
-      </w:tblPr>
-      <w:tcPr>
         <w:shd w:val="clear" w:color="ffffff"/>
         <w:tcBorders>
           <w:top w:val="none" w:color="000000" w:sz="4" w:space="0"/>
@@ -7540,30 +7734,7 @@
         </w:tcBorders>
       </w:tcPr>
     </w:tblStylePr>
-    <w:tblStylePr w:type="lastCol">
-      <w:rPr>
-        <w:i/>
-        <w:color w:val="404040"/>
-      </w:rPr>
-      <w:pPr>
-        <w:pBdr/>
-        <w:spacing/>
-        <w:ind/>
-      </w:pPr>
-      <w:tblPr>
-        <w:tblBorders/>
-      </w:tblPr>
-      <w:tcPr>
-        <w:shd w:color="ffffff"/>
-        <w:tcBorders>
-          <w:top w:val="none" w:color="000000" w:sz="4" w:space="0"/>
-          <w:left w:val="none" w:color="000000" w:sz="4" w:space="0"/>
-          <w:bottom w:val="none" w:color="000000" w:sz="4" w:space="0"/>
-          <w:right w:val="none" w:color="000000" w:sz="4" w:space="0"/>
-        </w:tcBorders>
-      </w:tcPr>
-    </w:tblStylePr>
-    <w:tblStylePr w:type="lastRow">
+    <w:tblStylePr w:type="firstRow">
       <w:rPr>
         <w:b/>
         <w:color w:val="404040"/>
@@ -7586,6 +7757,52 @@
         </w:tcBorders>
       </w:tcPr>
     </w:tblStylePr>
+    <w:tblStylePr w:type="lastCol">
+      <w:rPr>
+        <w:i/>
+        <w:color w:val="404040"/>
+      </w:rPr>
+      <w:pPr>
+        <w:pBdr/>
+        <w:spacing/>
+        <w:ind/>
+      </w:pPr>
+      <w:tblPr>
+        <w:tblBorders/>
+      </w:tblPr>
+      <w:tcPr>
+        <w:shd w:val="clear" w:color="ffffff"/>
+        <w:tcBorders>
+          <w:top w:val="none" w:color="000000" w:sz="4" w:space="0"/>
+          <w:left w:val="none" w:color="000000" w:sz="4" w:space="0"/>
+          <w:bottom w:val="none" w:color="000000" w:sz="4" w:space="0"/>
+          <w:right w:val="none" w:color="000000" w:sz="4" w:space="0"/>
+        </w:tcBorders>
+      </w:tcPr>
+    </w:tblStylePr>
+    <w:tblStylePr w:type="lastRow">
+      <w:rPr>
+        <w:b/>
+        <w:color w:val="404040"/>
+      </w:rPr>
+      <w:pPr>
+        <w:pBdr/>
+        <w:spacing/>
+        <w:ind/>
+      </w:pPr>
+      <w:tblPr>
+        <w:tblBorders/>
+      </w:tblPr>
+      <w:tcPr>
+        <w:shd w:val="clear" w:color="ffffff"/>
+        <w:tcBorders>
+          <w:top w:val="none" w:color="000000" w:sz="4" w:space="0"/>
+          <w:left w:val="none" w:color="000000" w:sz="4" w:space="0"/>
+          <w:bottom w:val="none" w:color="000000" w:sz="4" w:space="0"/>
+          <w:right w:val="none" w:color="000000" w:sz="4" w:space="0"/>
+        </w:tcBorders>
+      </w:tcPr>
+    </w:tblStylePr>
     <w:tblStylePr w:type="nwCell">
       <w:pPr>
         <w:pBdr/>
@@ -7652,9 +7869,9 @@
       </w:tcPr>
     </w:tblStylePr>
   </w:style>
-  <w:style w:type="table" w:styleId="38">
+  <w:style w:type="table" w:styleId="727">
     <w:name w:val="Grid Table 3 - Accent 5"/>
-    <w:basedOn w:val="665"/>
+    <w:basedOn w:val="887"/>
     <w:uiPriority w:val="99"/>
     <w:pPr>
       <w:pBdr/>
@@ -7753,29 +7970,6 @@
         <w:tblBorders/>
       </w:tblPr>
       <w:tcPr>
-        <w:shd w:color="ffffff"/>
-        <w:tcBorders>
-          <w:top w:val="none" w:color="000000" w:sz="4" w:space="0"/>
-          <w:left w:val="none" w:color="000000" w:sz="4" w:space="0"/>
-          <w:bottom w:val="none" w:color="000000" w:sz="4" w:space="0"/>
-          <w:right w:val="none" w:color="000000" w:sz="4" w:space="0"/>
-        </w:tcBorders>
-      </w:tcPr>
-    </w:tblStylePr>
-    <w:tblStylePr w:type="firstRow">
-      <w:rPr>
-        <w:b/>
-        <w:color w:val="404040"/>
-      </w:rPr>
-      <w:pPr>
-        <w:pBdr/>
-        <w:spacing/>
-        <w:ind/>
-      </w:pPr>
-      <w:tblPr>
-        <w:tblBorders/>
-      </w:tblPr>
-      <w:tcPr>
         <w:shd w:val="clear" w:color="ffffff"/>
         <w:tcBorders>
           <w:top w:val="none" w:color="000000" w:sz="4" w:space="0"/>
@@ -7785,30 +7979,7 @@
         </w:tcBorders>
       </w:tcPr>
     </w:tblStylePr>
-    <w:tblStylePr w:type="lastCol">
-      <w:rPr>
-        <w:i/>
-        <w:color w:val="404040"/>
-      </w:rPr>
-      <w:pPr>
-        <w:pBdr/>
-        <w:spacing/>
-        <w:ind/>
-      </w:pPr>
-      <w:tblPr>
-        <w:tblBorders/>
-      </w:tblPr>
-      <w:tcPr>
-        <w:shd w:color="ffffff"/>
-        <w:tcBorders>
-          <w:top w:val="none" w:color="000000" w:sz="4" w:space="0"/>
-          <w:left w:val="none" w:color="000000" w:sz="4" w:space="0"/>
-          <w:bottom w:val="none" w:color="000000" w:sz="4" w:space="0"/>
-          <w:right w:val="none" w:color="000000" w:sz="4" w:space="0"/>
-        </w:tcBorders>
-      </w:tcPr>
-    </w:tblStylePr>
-    <w:tblStylePr w:type="lastRow">
+    <w:tblStylePr w:type="firstRow">
       <w:rPr>
         <w:b/>
         <w:color w:val="404040"/>
@@ -7831,6 +8002,52 @@
         </w:tcBorders>
       </w:tcPr>
     </w:tblStylePr>
+    <w:tblStylePr w:type="lastCol">
+      <w:rPr>
+        <w:i/>
+        <w:color w:val="404040"/>
+      </w:rPr>
+      <w:pPr>
+        <w:pBdr/>
+        <w:spacing/>
+        <w:ind/>
+      </w:pPr>
+      <w:tblPr>
+        <w:tblBorders/>
+      </w:tblPr>
+      <w:tcPr>
+        <w:shd w:val="clear" w:color="ffffff"/>
+        <w:tcBorders>
+          <w:top w:val="none" w:color="000000" w:sz="4" w:space="0"/>
+          <w:left w:val="none" w:color="000000" w:sz="4" w:space="0"/>
+          <w:bottom w:val="none" w:color="000000" w:sz="4" w:space="0"/>
+          <w:right w:val="none" w:color="000000" w:sz="4" w:space="0"/>
+        </w:tcBorders>
+      </w:tcPr>
+    </w:tblStylePr>
+    <w:tblStylePr w:type="lastRow">
+      <w:rPr>
+        <w:b/>
+        <w:color w:val="404040"/>
+      </w:rPr>
+      <w:pPr>
+        <w:pBdr/>
+        <w:spacing/>
+        <w:ind/>
+      </w:pPr>
+      <w:tblPr>
+        <w:tblBorders/>
+      </w:tblPr>
+      <w:tcPr>
+        <w:shd w:val="clear" w:color="ffffff"/>
+        <w:tcBorders>
+          <w:top w:val="none" w:color="000000" w:sz="4" w:space="0"/>
+          <w:left w:val="none" w:color="000000" w:sz="4" w:space="0"/>
+          <w:bottom w:val="none" w:color="000000" w:sz="4" w:space="0"/>
+          <w:right w:val="none" w:color="000000" w:sz="4" w:space="0"/>
+        </w:tcBorders>
+      </w:tcPr>
+    </w:tblStylePr>
     <w:tblStylePr w:type="nwCell">
       <w:pPr>
         <w:pBdr/>
@@ -7897,9 +8114,9 @@
       </w:tcPr>
     </w:tblStylePr>
   </w:style>
-  <w:style w:type="table" w:styleId="39">
+  <w:style w:type="table" w:styleId="728">
     <w:name w:val="Grid Table 3 - Accent 6"/>
-    <w:basedOn w:val="665"/>
+    <w:basedOn w:val="887"/>
     <w:uiPriority w:val="99"/>
     <w:pPr>
       <w:pBdr/>
@@ -7998,29 +8215,6 @@
         <w:tblBorders/>
       </w:tblPr>
       <w:tcPr>
-        <w:shd w:color="ffffff"/>
-        <w:tcBorders>
-          <w:top w:val="none" w:color="000000" w:sz="4" w:space="0"/>
-          <w:left w:val="none" w:color="000000" w:sz="4" w:space="0"/>
-          <w:bottom w:val="none" w:color="000000" w:sz="4" w:space="0"/>
-          <w:right w:val="none" w:color="000000" w:sz="4" w:space="0"/>
-        </w:tcBorders>
-      </w:tcPr>
-    </w:tblStylePr>
-    <w:tblStylePr w:type="firstRow">
-      <w:rPr>
-        <w:b/>
-        <w:color w:val="404040"/>
-      </w:rPr>
-      <w:pPr>
-        <w:pBdr/>
-        <w:spacing/>
-        <w:ind/>
-      </w:pPr>
-      <w:tblPr>
-        <w:tblBorders/>
-      </w:tblPr>
-      <w:tcPr>
         <w:shd w:val="clear" w:color="ffffff"/>
         <w:tcBorders>
           <w:top w:val="none" w:color="000000" w:sz="4" w:space="0"/>
@@ -8030,30 +8224,7 @@
         </w:tcBorders>
       </w:tcPr>
     </w:tblStylePr>
-    <w:tblStylePr w:type="lastCol">
-      <w:rPr>
-        <w:i/>
-        <w:color w:val="404040"/>
-      </w:rPr>
-      <w:pPr>
-        <w:pBdr/>
-        <w:spacing/>
-        <w:ind/>
-      </w:pPr>
-      <w:tblPr>
-        <w:tblBorders/>
-      </w:tblPr>
-      <w:tcPr>
-        <w:shd w:color="ffffff"/>
-        <w:tcBorders>
-          <w:top w:val="none" w:color="000000" w:sz="4" w:space="0"/>
-          <w:left w:val="none" w:color="000000" w:sz="4" w:space="0"/>
-          <w:bottom w:val="none" w:color="000000" w:sz="4" w:space="0"/>
-          <w:right w:val="none" w:color="000000" w:sz="4" w:space="0"/>
-        </w:tcBorders>
-      </w:tcPr>
-    </w:tblStylePr>
-    <w:tblStylePr w:type="lastRow">
+    <w:tblStylePr w:type="firstRow">
       <w:rPr>
         <w:b/>
         <w:color w:val="404040"/>
@@ -8076,6 +8247,52 @@
         </w:tcBorders>
       </w:tcPr>
     </w:tblStylePr>
+    <w:tblStylePr w:type="lastCol">
+      <w:rPr>
+        <w:i/>
+        <w:color w:val="404040"/>
+      </w:rPr>
+      <w:pPr>
+        <w:pBdr/>
+        <w:spacing/>
+        <w:ind/>
+      </w:pPr>
+      <w:tblPr>
+        <w:tblBorders/>
+      </w:tblPr>
+      <w:tcPr>
+        <w:shd w:val="clear" w:color="ffffff"/>
+        <w:tcBorders>
+          <w:top w:val="none" w:color="000000" w:sz="4" w:space="0"/>
+          <w:left w:val="none" w:color="000000" w:sz="4" w:space="0"/>
+          <w:bottom w:val="none" w:color="000000" w:sz="4" w:space="0"/>
+          <w:right w:val="none" w:color="000000" w:sz="4" w:space="0"/>
+        </w:tcBorders>
+      </w:tcPr>
+    </w:tblStylePr>
+    <w:tblStylePr w:type="lastRow">
+      <w:rPr>
+        <w:b/>
+        <w:color w:val="404040"/>
+      </w:rPr>
+      <w:pPr>
+        <w:pBdr/>
+        <w:spacing/>
+        <w:ind/>
+      </w:pPr>
+      <w:tblPr>
+        <w:tblBorders/>
+      </w:tblPr>
+      <w:tcPr>
+        <w:shd w:val="clear" w:color="ffffff"/>
+        <w:tcBorders>
+          <w:top w:val="none" w:color="000000" w:sz="4" w:space="0"/>
+          <w:left w:val="none" w:color="000000" w:sz="4" w:space="0"/>
+          <w:bottom w:val="none" w:color="000000" w:sz="4" w:space="0"/>
+          <w:right w:val="none" w:color="000000" w:sz="4" w:space="0"/>
+        </w:tcBorders>
+      </w:tcPr>
+    </w:tblStylePr>
     <w:tblStylePr w:type="nwCell">
       <w:pPr>
         <w:pBdr/>
@@ -8142,9 +8359,9 @@
       </w:tcPr>
     </w:tblStylePr>
   </w:style>
-  <w:style w:type="table" w:styleId="40">
+  <w:style w:type="table" w:styleId="729">
     <w:name w:val="Grid Table 4"/>
-    <w:basedOn w:val="665"/>
+    <w:basedOn w:val="887"/>
     <w:uiPriority w:val="59"/>
     <w:pPr>
       <w:pBdr/>
@@ -8375,9 +8592,9 @@
       </w:tcPr>
     </w:tblStylePr>
   </w:style>
-  <w:style w:type="table" w:styleId="41">
+  <w:style w:type="table" w:styleId="730">
     <w:name w:val="Grid Table 4 - Accent 1"/>
-    <w:basedOn w:val="665"/>
+    <w:basedOn w:val="887"/>
     <w:uiPriority w:val="59"/>
     <w:pPr>
       <w:pBdr/>
@@ -8608,9 +8825,9 @@
       </w:tcPr>
     </w:tblStylePr>
   </w:style>
-  <w:style w:type="table" w:styleId="42">
+  <w:style w:type="table" w:styleId="731">
     <w:name w:val="Grid Table 4 - Accent 2"/>
-    <w:basedOn w:val="665"/>
+    <w:basedOn w:val="887"/>
     <w:uiPriority w:val="59"/>
     <w:pPr>
       <w:pBdr/>
@@ -8841,9 +9058,9 @@
       </w:tcPr>
     </w:tblStylePr>
   </w:style>
-  <w:style w:type="table" w:styleId="43">
+  <w:style w:type="table" w:styleId="732">
     <w:name w:val="Grid Table 4 - Accent 3"/>
-    <w:basedOn w:val="665"/>
+    <w:basedOn w:val="887"/>
     <w:uiPriority w:val="59"/>
     <w:pPr>
       <w:pBdr/>
@@ -9074,9 +9291,9 @@
       </w:tcPr>
     </w:tblStylePr>
   </w:style>
-  <w:style w:type="table" w:styleId="44">
+  <w:style w:type="table" w:styleId="733">
     <w:name w:val="Grid Table 4 - Accent 4"/>
-    <w:basedOn w:val="665"/>
+    <w:basedOn w:val="887"/>
     <w:uiPriority w:val="59"/>
     <w:pPr>
       <w:pBdr/>
@@ -9307,9 +9524,9 @@
       </w:tcPr>
     </w:tblStylePr>
   </w:style>
-  <w:style w:type="table" w:styleId="45">
+  <w:style w:type="table" w:styleId="734">
     <w:name w:val="Grid Table 4 - Accent 5"/>
-    <w:basedOn w:val="665"/>
+    <w:basedOn w:val="887"/>
     <w:uiPriority w:val="59"/>
     <w:pPr>
       <w:pBdr/>
@@ -9540,9 +9757,9 @@
       </w:tcPr>
     </w:tblStylePr>
   </w:style>
-  <w:style w:type="table" w:styleId="46">
+  <w:style w:type="table" w:styleId="735">
     <w:name w:val="Grid Table 4 - Accent 6"/>
-    <w:basedOn w:val="665"/>
+    <w:basedOn w:val="887"/>
     <w:uiPriority w:val="59"/>
     <w:pPr>
       <w:pBdr/>
@@ -9773,9 +9990,9 @@
       </w:tcPr>
     </w:tblStylePr>
   </w:style>
-  <w:style w:type="table" w:styleId="47">
+  <w:style w:type="table" w:styleId="736">
     <w:name w:val="Grid Table 5 Dark"/>
-    <w:basedOn w:val="665"/>
+    <w:basedOn w:val="887"/>
     <w:uiPriority w:val="99"/>
     <w:pPr>
       <w:pBdr/>
@@ -10001,9 +10218,9 @@
       </w:tcPr>
     </w:tblStylePr>
   </w:style>
-  <w:style w:type="table" w:styleId="48">
+  <w:style w:type="table" w:styleId="737">
     <w:name w:val="Grid Table 5 Dark- Accent 1"/>
-    <w:basedOn w:val="665"/>
+    <w:basedOn w:val="887"/>
     <w:uiPriority w:val="99"/>
     <w:pPr>
       <w:pBdr/>
@@ -10229,9 +10446,9 @@
       </w:tcPr>
     </w:tblStylePr>
   </w:style>
-  <w:style w:type="table" w:styleId="49">
+  <w:style w:type="table" w:styleId="738">
     <w:name w:val="Grid Table 5 Dark - Accent 2"/>
-    <w:basedOn w:val="665"/>
+    <w:basedOn w:val="887"/>
     <w:uiPriority w:val="99"/>
     <w:pPr>
       <w:pBdr/>
@@ -10457,9 +10674,9 @@
       </w:tcPr>
     </w:tblStylePr>
   </w:style>
-  <w:style w:type="table" w:styleId="50">
+  <w:style w:type="table" w:styleId="739">
     <w:name w:val="Grid Table 5 Dark - Accent 3"/>
-    <w:basedOn w:val="665"/>
+    <w:basedOn w:val="887"/>
     <w:uiPriority w:val="99"/>
     <w:pPr>
       <w:pBdr/>
@@ -10685,9 +10902,9 @@
       </w:tcPr>
     </w:tblStylePr>
   </w:style>
-  <w:style w:type="table" w:styleId="51">
+  <w:style w:type="table" w:styleId="740">
     <w:name w:val="Grid Table 5 Dark- Accent 4"/>
-    <w:basedOn w:val="665"/>
+    <w:basedOn w:val="887"/>
     <w:uiPriority w:val="99"/>
     <w:pPr>
       <w:pBdr/>
@@ -10913,9 +11130,9 @@
       </w:tcPr>
     </w:tblStylePr>
   </w:style>
-  <w:style w:type="table" w:styleId="52">
+  <w:style w:type="table" w:styleId="741">
     <w:name w:val="Grid Table 5 Dark - Accent 5"/>
-    <w:basedOn w:val="665"/>
+    <w:basedOn w:val="887"/>
     <w:uiPriority w:val="99"/>
     <w:pPr>
       <w:pBdr/>
@@ -11141,9 +11358,9 @@
       </w:tcPr>
     </w:tblStylePr>
   </w:style>
-  <w:style w:type="table" w:styleId="53">
+  <w:style w:type="table" w:styleId="742">
     <w:name w:val="Grid Table 5 Dark - Accent 6"/>
-    <w:basedOn w:val="665"/>
+    <w:basedOn w:val="887"/>
     <w:uiPriority w:val="99"/>
     <w:pPr>
       <w:pBdr/>
@@ -11369,9 +11586,9 @@
       </w:tcPr>
     </w:tblStylePr>
   </w:style>
-  <w:style w:type="table" w:styleId="54">
+  <w:style w:type="table" w:styleId="743">
     <w:name w:val="Grid Table 6 Colorful"/>
-    <w:basedOn w:val="665"/>
+    <w:basedOn w:val="887"/>
     <w:uiPriority w:val="99"/>
     <w:pPr>
       <w:pBdr/>
@@ -11599,9 +11816,9 @@
       </w:tcPr>
     </w:tblStylePr>
   </w:style>
-  <w:style w:type="table" w:styleId="55">
+  <w:style w:type="table" w:styleId="744">
     <w:name w:val="Grid Table 6 Colorful - Accent 1"/>
-    <w:basedOn w:val="665"/>
+    <w:basedOn w:val="887"/>
     <w:uiPriority w:val="99"/>
     <w:pPr>
       <w:pBdr/>
@@ -11829,9 +12046,9 @@
       </w:tcPr>
     </w:tblStylePr>
   </w:style>
-  <w:style w:type="table" w:styleId="56">
+  <w:style w:type="table" w:styleId="745">
     <w:name w:val="Grid Table 6 Colorful - Accent 2"/>
-    <w:basedOn w:val="665"/>
+    <w:basedOn w:val="887"/>
     <w:uiPriority w:val="99"/>
     <w:pPr>
       <w:pBdr/>
@@ -12059,9 +12276,9 @@
       </w:tcPr>
     </w:tblStylePr>
   </w:style>
-  <w:style w:type="table" w:styleId="57">
+  <w:style w:type="table" w:styleId="746">
     <w:name w:val="Grid Table 6 Colorful - Accent 3"/>
-    <w:basedOn w:val="665"/>
+    <w:basedOn w:val="887"/>
     <w:uiPriority w:val="99"/>
     <w:pPr>
       <w:pBdr/>
@@ -12289,9 +12506,9 @@
       </w:tcPr>
     </w:tblStylePr>
   </w:style>
-  <w:style w:type="table" w:styleId="58">
+  <w:style w:type="table" w:styleId="747">
     <w:name w:val="Grid Table 6 Colorful - Accent 4"/>
-    <w:basedOn w:val="665"/>
+    <w:basedOn w:val="887"/>
     <w:uiPriority w:val="99"/>
     <w:pPr>
       <w:pBdr/>
@@ -12519,9 +12736,9 @@
       </w:tcPr>
     </w:tblStylePr>
   </w:style>
-  <w:style w:type="table" w:styleId="59">
+  <w:style w:type="table" w:styleId="748">
     <w:name w:val="Grid Table 6 Colorful - Accent 5"/>
-    <w:basedOn w:val="665"/>
+    <w:basedOn w:val="887"/>
     <w:uiPriority w:val="99"/>
     <w:pPr>
       <w:pBdr/>
@@ -12749,9 +12966,9 @@
       </w:tcPr>
     </w:tblStylePr>
   </w:style>
-  <w:style w:type="table" w:styleId="60">
+  <w:style w:type="table" w:styleId="749">
     <w:name w:val="Grid Table 6 Colorful - Accent 6"/>
-    <w:basedOn w:val="665"/>
+    <w:basedOn w:val="887"/>
     <w:uiPriority w:val="99"/>
     <w:pPr>
       <w:pBdr/>
@@ -12979,9 +13196,9 @@
       </w:tcPr>
     </w:tblStylePr>
   </w:style>
-  <w:style w:type="table" w:styleId="61">
+  <w:style w:type="table" w:styleId="750">
     <w:name w:val="Grid Table 7 Colorful"/>
-    <w:basedOn w:val="665"/>
+    <w:basedOn w:val="887"/>
     <w:uiPriority w:val="99"/>
     <w:pPr>
       <w:pBdr/>
@@ -13083,11 +13300,11 @@
         <w:tblBorders/>
       </w:tblPr>
       <w:tcPr>
-        <w:shd w:color="ffffff"/>
+        <w:shd w:val="clear" w:color="ffffff"/>
         <w:tcBorders>
-          <w:top w:val="none"/>
-          <w:left w:val="none"/>
-          <w:bottom w:val="none"/>
+          <w:top w:val="none" w:color="000000" w:sz="4" w:space="0"/>
+          <w:left w:val="none" w:color="000000" w:sz="4" w:space="0"/>
+          <w:bottom w:val="none" w:color="000000" w:sz="4" w:space="0"/>
           <w:right w:val="single" w:color="000000" w:themeColor="text1" w:themeTint="80" w:sz="4" w:space="0"/>
         </w:tcBorders>
       </w:tcPr>
@@ -13110,10 +13327,10 @@
       <w:tcPr>
         <w:shd w:val="clear" w:color="ffffff" w:themeColor="light1" w:fill="ffffff" w:themeFill="light1"/>
         <w:tcBorders>
-          <w:top w:val="none"/>
-          <w:left w:val="none"/>
+          <w:top w:val="none" w:color="000000" w:sz="4" w:space="0"/>
+          <w:left w:val="none" w:color="000000" w:sz="4" w:space="0"/>
           <w:bottom w:val="single" w:color="000000" w:themeColor="text1" w:themeTint="80" w:sz="4" w:space="0"/>
-          <w:right w:val="none"/>
+          <w:right w:val="none" w:color="000000" w:sz="4" w:space="0"/>
         </w:tcBorders>
       </w:tcPr>
     </w:tblStylePr>
@@ -13133,12 +13350,12 @@
         <w:tblBorders/>
       </w:tblPr>
       <w:tcPr>
-        <w:shd w:color="ffffff"/>
+        <w:shd w:val="clear" w:color="ffffff"/>
         <w:tcBorders>
-          <w:top w:val="none"/>
+          <w:top w:val="none" w:color="000000" w:sz="4" w:space="0"/>
           <w:left w:val="single" w:color="000000" w:themeColor="text1" w:themeTint="80" w:sz="4" w:space="0"/>
-          <w:bottom w:val="none"/>
-          <w:right w:val="none"/>
+          <w:bottom w:val="none" w:color="000000" w:sz="4" w:space="0"/>
+          <w:right w:val="none" w:color="000000" w:sz="4" w:space="0"/>
         </w:tcBorders>
       </w:tcPr>
     </w:tblStylePr>
@@ -13161,9 +13378,9 @@
         <w:shd w:val="clear" w:color="ffffff" w:themeColor="light1" w:fill="ffffff" w:themeFill="light1"/>
         <w:tcBorders>
           <w:top w:val="single" w:color="000000" w:themeColor="text1" w:themeTint="80" w:sz="4" w:space="0"/>
-          <w:left w:val="none"/>
-          <w:bottom w:val="none"/>
-          <w:right w:val="none"/>
+          <w:left w:val="none" w:color="000000" w:sz="4" w:space="0"/>
+          <w:bottom w:val="none" w:color="000000" w:sz="4" w:space="0"/>
+          <w:right w:val="none" w:color="000000" w:sz="4" w:space="0"/>
         </w:tcBorders>
       </w:tcPr>
     </w:tblStylePr>
@@ -13233,9 +13450,9 @@
       </w:tcPr>
     </w:tblStylePr>
   </w:style>
-  <w:style w:type="table" w:styleId="62">
+  <w:style w:type="table" w:styleId="751">
     <w:name w:val="Grid Table 7 Colorful - Accent 1"/>
-    <w:basedOn w:val="665"/>
+    <w:basedOn w:val="887"/>
     <w:uiPriority w:val="99"/>
     <w:pPr>
       <w:pBdr/>
@@ -13337,11 +13554,11 @@
         <w:tblBorders/>
       </w:tblPr>
       <w:tcPr>
-        <w:shd w:color="ffffff"/>
+        <w:shd w:val="clear" w:color="ffffff"/>
         <w:tcBorders>
-          <w:top w:val="none"/>
-          <w:left w:val="none"/>
-          <w:bottom w:val="none"/>
+          <w:top w:val="none" w:color="000000" w:sz="4" w:space="0"/>
+          <w:left w:val="none" w:color="000000" w:sz="4" w:space="0"/>
+          <w:bottom w:val="none" w:color="000000" w:sz="4" w:space="0"/>
           <w:right w:val="single" w:color="000000" w:themeColor="accent1" w:themeTint="80" w:sz="4" w:space="0"/>
         </w:tcBorders>
       </w:tcPr>
@@ -13364,10 +13581,10 @@
       <w:tcPr>
         <w:shd w:val="clear" w:color="ffffff" w:themeColor="light1" w:fill="ffffff" w:themeFill="light1"/>
         <w:tcBorders>
-          <w:top w:val="none"/>
-          <w:left w:val="none"/>
+          <w:top w:val="none" w:color="000000" w:sz="4" w:space="0"/>
+          <w:left w:val="none" w:color="000000" w:sz="4" w:space="0"/>
           <w:bottom w:val="single" w:color="000000" w:themeColor="accent1" w:themeTint="80" w:sz="4" w:space="0"/>
-          <w:right w:val="none"/>
+          <w:right w:val="none" w:color="000000" w:sz="4" w:space="0"/>
         </w:tcBorders>
       </w:tcPr>
     </w:tblStylePr>
@@ -13387,12 +13604,12 @@
         <w:tblBorders/>
       </w:tblPr>
       <w:tcPr>
-        <w:shd w:color="ffffff"/>
+        <w:shd w:val="clear" w:color="ffffff"/>
         <w:tcBorders>
-          <w:top w:val="none"/>
+          <w:top w:val="none" w:color="000000" w:sz="4" w:space="0"/>
           <w:left w:val="single" w:color="000000" w:themeColor="accent1" w:themeTint="80" w:sz="4" w:space="0"/>
-          <w:bottom w:val="none"/>
-          <w:right w:val="none"/>
+          <w:bottom w:val="none" w:color="000000" w:sz="4" w:space="0"/>
+          <w:right w:val="none" w:color="000000" w:sz="4" w:space="0"/>
         </w:tcBorders>
       </w:tcPr>
     </w:tblStylePr>
@@ -13415,9 +13632,9 @@
         <w:shd w:val="clear" w:color="ffffff" w:themeColor="light1" w:fill="ffffff" w:themeFill="light1"/>
         <w:tcBorders>
           <w:top w:val="single" w:color="000000" w:themeColor="accent1" w:themeTint="80" w:sz="4" w:space="0"/>
-          <w:left w:val="none"/>
-          <w:bottom w:val="none"/>
-          <w:right w:val="none"/>
+          <w:left w:val="none" w:color="000000" w:sz="4" w:space="0"/>
+          <w:bottom w:val="none" w:color="000000" w:sz="4" w:space="0"/>
+          <w:right w:val="none" w:color="000000" w:sz="4" w:space="0"/>
         </w:tcBorders>
       </w:tcPr>
     </w:tblStylePr>
@@ -13487,9 +13704,9 @@
       </w:tcPr>
     </w:tblStylePr>
   </w:style>
-  <w:style w:type="table" w:styleId="63">
+  <w:style w:type="table" w:styleId="752">
     <w:name w:val="Grid Table 7 Colorful - Accent 2"/>
-    <w:basedOn w:val="665"/>
+    <w:basedOn w:val="887"/>
     <w:uiPriority w:val="99"/>
     <w:pPr>
       <w:pBdr/>
@@ -13591,11 +13808,11 @@
         <w:tblBorders/>
       </w:tblPr>
       <w:tcPr>
-        <w:shd w:color="ffffff"/>
+        <w:shd w:val="clear" w:color="ffffff"/>
         <w:tcBorders>
-          <w:top w:val="none"/>
-          <w:left w:val="none"/>
-          <w:bottom w:val="none"/>
+          <w:top w:val="none" w:color="000000" w:sz="4" w:space="0"/>
+          <w:left w:val="none" w:color="000000" w:sz="4" w:space="0"/>
+          <w:bottom w:val="none" w:color="000000" w:sz="4" w:space="0"/>
           <w:right w:val="single" w:color="000000" w:themeColor="accent2" w:themeTint="97" w:sz="4" w:space="0"/>
         </w:tcBorders>
       </w:tcPr>
@@ -13618,10 +13835,10 @@
       <w:tcPr>
         <w:shd w:val="clear" w:color="ffffff" w:themeColor="light1" w:fill="ffffff" w:themeFill="light1"/>
         <w:tcBorders>
-          <w:top w:val="none"/>
-          <w:left w:val="none"/>
+          <w:top w:val="none" w:color="000000" w:sz="4" w:space="0"/>
+          <w:left w:val="none" w:color="000000" w:sz="4" w:space="0"/>
           <w:bottom w:val="single" w:color="000000" w:themeColor="accent2" w:themeTint="97" w:sz="4" w:space="0"/>
-          <w:right w:val="none"/>
+          <w:right w:val="none" w:color="000000" w:sz="4" w:space="0"/>
         </w:tcBorders>
       </w:tcPr>
     </w:tblStylePr>
@@ -13641,12 +13858,12 @@
         <w:tblBorders/>
       </w:tblPr>
       <w:tcPr>
-        <w:shd w:color="ffffff"/>
+        <w:shd w:val="clear" w:color="ffffff"/>
         <w:tcBorders>
-          <w:top w:val="none"/>
+          <w:top w:val="none" w:color="000000" w:sz="4" w:space="0"/>
           <w:left w:val="single" w:color="000000" w:themeColor="accent2" w:themeTint="97" w:sz="4" w:space="0"/>
-          <w:bottom w:val="none"/>
-          <w:right w:val="none"/>
+          <w:bottom w:val="none" w:color="000000" w:sz="4" w:space="0"/>
+          <w:right w:val="none" w:color="000000" w:sz="4" w:space="0"/>
         </w:tcBorders>
       </w:tcPr>
     </w:tblStylePr>
@@ -13669,9 +13886,9 @@
         <w:shd w:val="clear" w:color="ffffff" w:themeColor="light1" w:fill="ffffff" w:themeFill="light1"/>
         <w:tcBorders>
           <w:top w:val="single" w:color="000000" w:themeColor="accent2" w:themeTint="97" w:sz="4" w:space="0"/>
-          <w:left w:val="none"/>
-          <w:bottom w:val="none"/>
-          <w:right w:val="none"/>
+          <w:left w:val="none" w:color="000000" w:sz="4" w:space="0"/>
+          <w:bottom w:val="none" w:color="000000" w:sz="4" w:space="0"/>
+          <w:right w:val="none" w:color="000000" w:sz="4" w:space="0"/>
         </w:tcBorders>
       </w:tcPr>
     </w:tblStylePr>
@@ -13741,9 +13958,9 @@
       </w:tcPr>
     </w:tblStylePr>
   </w:style>
-  <w:style w:type="table" w:styleId="64">
+  <w:style w:type="table" w:styleId="753">
     <w:name w:val="Grid Table 7 Colorful - Accent 3"/>
-    <w:basedOn w:val="665"/>
+    <w:basedOn w:val="887"/>
     <w:uiPriority w:val="99"/>
     <w:pPr>
       <w:pBdr/>
@@ -13845,11 +14062,11 @@
         <w:tblBorders/>
       </w:tblPr>
       <w:tcPr>
-        <w:shd w:color="ffffff"/>
+        <w:shd w:val="clear" w:color="ffffff"/>
         <w:tcBorders>
-          <w:top w:val="none"/>
-          <w:left w:val="none"/>
-          <w:bottom w:val="none"/>
+          <w:top w:val="none" w:color="000000" w:sz="4" w:space="0"/>
+          <w:left w:val="none" w:color="000000" w:sz="4" w:space="0"/>
+          <w:bottom w:val="none" w:color="000000" w:sz="4" w:space="0"/>
           <w:right w:val="single" w:color="000000" w:themeColor="accent3" w:themeTint="FE" w:sz="4" w:space="0"/>
         </w:tcBorders>
       </w:tcPr>
@@ -13872,10 +14089,10 @@
       <w:tcPr>
         <w:shd w:val="clear" w:color="ffffff" w:themeColor="light1" w:fill="ffffff" w:themeFill="light1"/>
         <w:tcBorders>
-          <w:top w:val="none"/>
-          <w:left w:val="none"/>
+          <w:top w:val="none" w:color="000000" w:sz="4" w:space="0"/>
+          <w:left w:val="none" w:color="000000" w:sz="4" w:space="0"/>
           <w:bottom w:val="single" w:color="000000" w:themeColor="accent3" w:themeTint="FE" w:sz="4" w:space="0"/>
-          <w:right w:val="none"/>
+          <w:right w:val="none" w:color="000000" w:sz="4" w:space="0"/>
         </w:tcBorders>
       </w:tcPr>
     </w:tblStylePr>
@@ -13895,12 +14112,12 @@
         <w:tblBorders/>
       </w:tblPr>
       <w:tcPr>
-        <w:shd w:color="ffffff"/>
+        <w:shd w:val="clear" w:color="ffffff"/>
         <w:tcBorders>
-          <w:top w:val="none"/>
+          <w:top w:val="none" w:color="000000" w:sz="4" w:space="0"/>
           <w:left w:val="single" w:color="000000" w:themeColor="accent3" w:themeTint="FE" w:sz="4" w:space="0"/>
-          <w:bottom w:val="none"/>
-          <w:right w:val="none"/>
+          <w:bottom w:val="none" w:color="000000" w:sz="4" w:space="0"/>
+          <w:right w:val="none" w:color="000000" w:sz="4" w:space="0"/>
         </w:tcBorders>
       </w:tcPr>
     </w:tblStylePr>
@@ -13923,9 +14140,9 @@
         <w:shd w:val="clear" w:color="ffffff" w:themeColor="light1" w:fill="ffffff" w:themeFill="light1"/>
         <w:tcBorders>
           <w:top w:val="single" w:color="000000" w:themeColor="accent3" w:themeTint="FE" w:sz="4" w:space="0"/>
-          <w:left w:val="none"/>
-          <w:bottom w:val="none"/>
-          <w:right w:val="none"/>
+          <w:left w:val="none" w:color="000000" w:sz="4" w:space="0"/>
+          <w:bottom w:val="none" w:color="000000" w:sz="4" w:space="0"/>
+          <w:right w:val="none" w:color="000000" w:sz="4" w:space="0"/>
         </w:tcBorders>
       </w:tcPr>
     </w:tblStylePr>
@@ -13995,9 +14212,9 @@
       </w:tcPr>
     </w:tblStylePr>
   </w:style>
-  <w:style w:type="table" w:styleId="65">
+  <w:style w:type="table" w:styleId="754">
     <w:name w:val="Grid Table 7 Colorful - Accent 4"/>
-    <w:basedOn w:val="665"/>
+    <w:basedOn w:val="887"/>
     <w:uiPriority w:val="99"/>
     <w:pPr>
       <w:pBdr/>
@@ -14099,11 +14316,11 @@
         <w:tblBorders/>
       </w:tblPr>
       <w:tcPr>
-        <w:shd w:color="ffffff"/>
+        <w:shd w:val="clear" w:color="ffffff"/>
         <w:tcBorders>
-          <w:top w:val="none"/>
-          <w:left w:val="none"/>
-          <w:bottom w:val="none"/>
+          <w:top w:val="none" w:color="000000" w:sz="4" w:space="0"/>
+          <w:left w:val="none" w:color="000000" w:sz="4" w:space="0"/>
+          <w:bottom w:val="none" w:color="000000" w:sz="4" w:space="0"/>
           <w:right w:val="single" w:color="000000" w:themeColor="accent4" w:themeTint="9A" w:sz="4" w:space="0"/>
         </w:tcBorders>
       </w:tcPr>
@@ -14126,10 +14343,10 @@
       <w:tcPr>
         <w:shd w:val="clear" w:color="ffffff" w:themeColor="light1" w:fill="ffffff" w:themeFill="light1"/>
         <w:tcBorders>
-          <w:top w:val="none"/>
-          <w:left w:val="none"/>
+          <w:top w:val="none" w:color="000000" w:sz="4" w:space="0"/>
+          <w:left w:val="none" w:color="000000" w:sz="4" w:space="0"/>
           <w:bottom w:val="single" w:color="000000" w:themeColor="accent4" w:themeTint="9A" w:sz="4" w:space="0"/>
-          <w:right w:val="none"/>
+          <w:right w:val="none" w:color="000000" w:sz="4" w:space="0"/>
         </w:tcBorders>
       </w:tcPr>
     </w:tblStylePr>
@@ -14149,12 +14366,12 @@
         <w:tblBorders/>
       </w:tblPr>
       <w:tcPr>
-        <w:shd w:color="ffffff"/>
+        <w:shd w:val="clear" w:color="ffffff"/>
         <w:tcBorders>
-          <w:top w:val="none"/>
+          <w:top w:val="none" w:color="000000" w:sz="4" w:space="0"/>
           <w:left w:val="single" w:color="000000" w:themeColor="accent4" w:themeTint="9A" w:sz="4" w:space="0"/>
-          <w:bottom w:val="none"/>
-          <w:right w:val="none"/>
+          <w:bottom w:val="none" w:color="000000" w:sz="4" w:space="0"/>
+          <w:right w:val="none" w:color="000000" w:sz="4" w:space="0"/>
         </w:tcBorders>
       </w:tcPr>
     </w:tblStylePr>
@@ -14177,9 +14394,9 @@
         <w:shd w:val="clear" w:color="ffffff" w:themeColor="light1" w:fill="ffffff" w:themeFill="light1"/>
         <w:tcBorders>
           <w:top w:val="single" w:color="000000" w:themeColor="accent4" w:themeTint="9A" w:sz="4" w:space="0"/>
-          <w:left w:val="none"/>
-          <w:bottom w:val="none"/>
-          <w:right w:val="none"/>
+          <w:left w:val="none" w:color="000000" w:sz="4" w:space="0"/>
+          <w:bottom w:val="none" w:color="000000" w:sz="4" w:space="0"/>
+          <w:right w:val="none" w:color="000000" w:sz="4" w:space="0"/>
         </w:tcBorders>
       </w:tcPr>
     </w:tblStylePr>
@@ -14249,9 +14466,9 @@
       </w:tcPr>
     </w:tblStylePr>
   </w:style>
-  <w:style w:type="table" w:styleId="66">
+  <w:style w:type="table" w:styleId="755">
     <w:name w:val="Grid Table 7 Colorful - Accent 5"/>
-    <w:basedOn w:val="665"/>
+    <w:basedOn w:val="887"/>
     <w:uiPriority w:val="99"/>
     <w:pPr>
       <w:pBdr/>
@@ -14353,11 +14570,11 @@
         <w:tblBorders/>
       </w:tblPr>
       <w:tcPr>
-        <w:shd w:color="ffffff"/>
+        <w:shd w:val="clear" w:color="ffffff"/>
         <w:tcBorders>
-          <w:top w:val="none"/>
-          <w:left w:val="none"/>
-          <w:bottom w:val="none"/>
+          <w:top w:val="none" w:color="000000" w:sz="4" w:space="0"/>
+          <w:left w:val="none" w:color="000000" w:sz="4" w:space="0"/>
+          <w:bottom w:val="none" w:color="000000" w:sz="4" w:space="0"/>
           <w:right w:val="single" w:color="000000" w:themeColor="accent5" w:themeTint="90" w:sz="4" w:space="0"/>
         </w:tcBorders>
       </w:tcPr>
@@ -14380,10 +14597,10 @@
       <w:tcPr>
         <w:shd w:val="clear" w:color="ffffff" w:themeColor="light1" w:fill="ffffff" w:themeFill="light1"/>
         <w:tcBorders>
-          <w:top w:val="none"/>
-          <w:left w:val="none"/>
+          <w:top w:val="none" w:color="000000" w:sz="4" w:space="0"/>
+          <w:left w:val="none" w:color="000000" w:sz="4" w:space="0"/>
           <w:bottom w:val="single" w:color="000000" w:themeColor="accent5" w:themeTint="90" w:sz="4" w:space="0"/>
-          <w:right w:val="none"/>
+          <w:right w:val="none" w:color="000000" w:sz="4" w:space="0"/>
         </w:tcBorders>
       </w:tcPr>
     </w:tblStylePr>
@@ -14403,12 +14620,12 @@
         <w:tblBorders/>
       </w:tblPr>
       <w:tcPr>
-        <w:shd w:color="ffffff"/>
+        <w:shd w:val="clear" w:color="ffffff"/>
         <w:tcBorders>
-          <w:top w:val="none"/>
+          <w:top w:val="none" w:color="000000" w:sz="4" w:space="0"/>
           <w:left w:val="single" w:color="000000" w:themeColor="accent5" w:themeTint="90" w:sz="4" w:space="0"/>
-          <w:bottom w:val="none"/>
-          <w:right w:val="none"/>
+          <w:bottom w:val="none" w:color="000000" w:sz="4" w:space="0"/>
+          <w:right w:val="none" w:color="000000" w:sz="4" w:space="0"/>
         </w:tcBorders>
       </w:tcPr>
     </w:tblStylePr>
@@ -14431,9 +14648,9 @@
         <w:shd w:val="clear" w:color="ffffff" w:themeColor="light1" w:fill="ffffff" w:themeFill="light1"/>
         <w:tcBorders>
           <w:top w:val="single" w:color="000000" w:themeColor="accent5" w:themeTint="90" w:sz="4" w:space="0"/>
-          <w:left w:val="none"/>
-          <w:bottom w:val="none"/>
-          <w:right w:val="none"/>
+          <w:left w:val="none" w:color="000000" w:sz="4" w:space="0"/>
+          <w:bottom w:val="none" w:color="000000" w:sz="4" w:space="0"/>
+          <w:right w:val="none" w:color="000000" w:sz="4" w:space="0"/>
         </w:tcBorders>
       </w:tcPr>
     </w:tblStylePr>
@@ -14503,9 +14720,9 @@
       </w:tcPr>
     </w:tblStylePr>
   </w:style>
-  <w:style w:type="table" w:styleId="67">
+  <w:style w:type="table" w:styleId="756">
     <w:name w:val="Grid Table 7 Colorful - Accent 6"/>
-    <w:basedOn w:val="665"/>
+    <w:basedOn w:val="887"/>
     <w:uiPriority w:val="99"/>
     <w:pPr>
       <w:pBdr/>
@@ -14607,11 +14824,11 @@
         <w:tblBorders/>
       </w:tblPr>
       <w:tcPr>
-        <w:shd w:color="ffffff"/>
+        <w:shd w:val="clear" w:color="ffffff"/>
         <w:tcBorders>
-          <w:top w:val="none"/>
-          <w:left w:val="none"/>
-          <w:bottom w:val="none"/>
+          <w:top w:val="none" w:color="000000" w:sz="4" w:space="0"/>
+          <w:left w:val="none" w:color="000000" w:sz="4" w:space="0"/>
+          <w:bottom w:val="none" w:color="000000" w:sz="4" w:space="0"/>
           <w:right w:val="single" w:color="000000" w:themeColor="accent6" w:themeTint="90" w:sz="4" w:space="0"/>
         </w:tcBorders>
       </w:tcPr>
@@ -14634,10 +14851,10 @@
       <w:tcPr>
         <w:shd w:val="clear" w:color="ffffff" w:themeColor="light1" w:fill="ffffff" w:themeFill="light1"/>
         <w:tcBorders>
-          <w:top w:val="none"/>
-          <w:left w:val="none"/>
+          <w:top w:val="none" w:color="000000" w:sz="4" w:space="0"/>
+          <w:left w:val="none" w:color="000000" w:sz="4" w:space="0"/>
           <w:bottom w:val="single" w:color="000000" w:themeColor="accent6" w:themeTint="90" w:sz="4" w:space="0"/>
-          <w:right w:val="none"/>
+          <w:right w:val="none" w:color="000000" w:sz="4" w:space="0"/>
         </w:tcBorders>
       </w:tcPr>
     </w:tblStylePr>
@@ -14657,12 +14874,12 @@
         <w:tblBorders/>
       </w:tblPr>
       <w:tcPr>
-        <w:shd w:color="ffffff"/>
+        <w:shd w:val="clear" w:color="ffffff"/>
         <w:tcBorders>
-          <w:top w:val="none"/>
+          <w:top w:val="none" w:color="000000" w:sz="4" w:space="0"/>
           <w:left w:val="single" w:color="000000" w:themeColor="accent6" w:themeTint="90" w:sz="4" w:space="0"/>
-          <w:bottom w:val="none"/>
-          <w:right w:val="none"/>
+          <w:bottom w:val="none" w:color="000000" w:sz="4" w:space="0"/>
+          <w:right w:val="none" w:color="000000" w:sz="4" w:space="0"/>
         </w:tcBorders>
       </w:tcPr>
     </w:tblStylePr>
@@ -14685,9 +14902,9 @@
         <w:shd w:val="clear" w:color="ffffff" w:themeColor="light1" w:fill="ffffff" w:themeFill="light1"/>
         <w:tcBorders>
           <w:top w:val="single" w:color="000000" w:themeColor="accent6" w:themeTint="90" w:sz="4" w:space="0"/>
-          <w:left w:val="none"/>
-          <w:bottom w:val="none"/>
-          <w:right w:val="none"/>
+          <w:left w:val="none" w:color="000000" w:sz="4" w:space="0"/>
+          <w:bottom w:val="none" w:color="000000" w:sz="4" w:space="0"/>
+          <w:right w:val="none" w:color="000000" w:sz="4" w:space="0"/>
         </w:tcBorders>
       </w:tcPr>
     </w:tblStylePr>
@@ -14757,9 +14974,9 @@
       </w:tcPr>
     </w:tblStylePr>
   </w:style>
-  <w:style w:type="table" w:styleId="68">
+  <w:style w:type="table" w:styleId="757">
     <w:name w:val="List Table 1 Light"/>
-    <w:basedOn w:val="665"/>
+    <w:basedOn w:val="887"/>
     <w:uiPriority w:val="99"/>
     <w:pPr>
       <w:pBdr/>
@@ -14973,9 +15190,9 @@
       </w:tcPr>
     </w:tblStylePr>
   </w:style>
-  <w:style w:type="table" w:styleId="69">
+  <w:style w:type="table" w:styleId="758">
     <w:name w:val="List Table 1 Light - Accent 1"/>
-    <w:basedOn w:val="665"/>
+    <w:basedOn w:val="887"/>
     <w:uiPriority w:val="99"/>
     <w:pPr>
       <w:pBdr/>
@@ -15189,9 +15406,9 @@
       </w:tcPr>
     </w:tblStylePr>
   </w:style>
-  <w:style w:type="table" w:styleId="70">
+  <w:style w:type="table" w:styleId="759">
     <w:name w:val="List Table 1 Light - Accent 2"/>
-    <w:basedOn w:val="665"/>
+    <w:basedOn w:val="887"/>
     <w:uiPriority w:val="99"/>
     <w:pPr>
       <w:pBdr/>
@@ -15405,9 +15622,9 @@
       </w:tcPr>
     </w:tblStylePr>
   </w:style>
-  <w:style w:type="table" w:styleId="71">
+  <w:style w:type="table" w:styleId="760">
     <w:name w:val="List Table 1 Light - Accent 3"/>
-    <w:basedOn w:val="665"/>
+    <w:basedOn w:val="887"/>
     <w:uiPriority w:val="99"/>
     <w:pPr>
       <w:pBdr/>
@@ -15621,9 +15838,9 @@
       </w:tcPr>
     </w:tblStylePr>
   </w:style>
-  <w:style w:type="table" w:styleId="72">
+  <w:style w:type="table" w:styleId="761">
     <w:name w:val="List Table 1 Light - Accent 4"/>
-    <w:basedOn w:val="665"/>
+    <w:basedOn w:val="887"/>
     <w:uiPriority w:val="99"/>
     <w:pPr>
       <w:pBdr/>
@@ -15837,9 +16054,9 @@
       </w:tcPr>
     </w:tblStylePr>
   </w:style>
-  <w:style w:type="table" w:styleId="73">
+  <w:style w:type="table" w:styleId="762">
     <w:name w:val="List Table 1 Light - Accent 5"/>
-    <w:basedOn w:val="665"/>
+    <w:basedOn w:val="887"/>
     <w:uiPriority w:val="99"/>
     <w:pPr>
       <w:pBdr/>
@@ -16053,9 +16270,9 @@
       </w:tcPr>
     </w:tblStylePr>
   </w:style>
-  <w:style w:type="table" w:styleId="74">
+  <w:style w:type="table" w:styleId="763">
     <w:name w:val="List Table 1 Light - Accent 6"/>
-    <w:basedOn w:val="665"/>
+    <w:basedOn w:val="887"/>
     <w:uiPriority w:val="99"/>
     <w:pPr>
       <w:pBdr/>
@@ -16269,9 +16486,9 @@
       </w:tcPr>
     </w:tblStylePr>
   </w:style>
-  <w:style w:type="table" w:styleId="75">
+  <w:style w:type="table" w:styleId="764">
     <w:name w:val="List Table 2"/>
-    <w:basedOn w:val="665"/>
+    <w:basedOn w:val="887"/>
     <w:uiPriority w:val="99"/>
     <w:pPr>
       <w:pBdr/>
@@ -16507,9 +16724,9 @@
       </w:tcPr>
     </w:tblStylePr>
   </w:style>
-  <w:style w:type="table" w:styleId="76">
+  <w:style w:type="table" w:styleId="765">
     <w:name w:val="List Table 2 - Accent 1"/>
-    <w:basedOn w:val="665"/>
+    <w:basedOn w:val="887"/>
     <w:uiPriority w:val="99"/>
     <w:pPr>
       <w:pBdr/>
@@ -16745,9 +16962,9 @@
       </w:tcPr>
     </w:tblStylePr>
   </w:style>
-  <w:style w:type="table" w:styleId="77">
+  <w:style w:type="table" w:styleId="766">
     <w:name w:val="List Table 2 - Accent 2"/>
-    <w:basedOn w:val="665"/>
+    <w:basedOn w:val="887"/>
     <w:uiPriority w:val="99"/>
     <w:pPr>
       <w:pBdr/>
@@ -16983,9 +17200,9 @@
       </w:tcPr>
     </w:tblStylePr>
   </w:style>
-  <w:style w:type="table" w:styleId="78">
+  <w:style w:type="table" w:styleId="767">
     <w:name w:val="List Table 2 - Accent 3"/>
-    <w:basedOn w:val="665"/>
+    <w:basedOn w:val="887"/>
     <w:uiPriority w:val="99"/>
     <w:pPr>
       <w:pBdr/>
@@ -17221,9 +17438,9 @@
       </w:tcPr>
     </w:tblStylePr>
   </w:style>
-  <w:style w:type="table" w:styleId="79">
+  <w:style w:type="table" w:styleId="768">
     <w:name w:val="List Table 2 - Accent 4"/>
-    <w:basedOn w:val="665"/>
+    <w:basedOn w:val="887"/>
     <w:uiPriority w:val="99"/>
     <w:pPr>
       <w:pBdr/>
@@ -17459,9 +17676,9 @@
       </w:tcPr>
     </w:tblStylePr>
   </w:style>
-  <w:style w:type="table" w:styleId="80">
+  <w:style w:type="table" w:styleId="769">
     <w:name w:val="List Table 2 - Accent 5"/>
-    <w:basedOn w:val="665"/>
+    <w:basedOn w:val="887"/>
     <w:uiPriority w:val="99"/>
     <w:pPr>
       <w:pBdr/>
@@ -17697,9 +17914,9 @@
       </w:tcPr>
     </w:tblStylePr>
   </w:style>
-  <w:style w:type="table" w:styleId="81">
+  <w:style w:type="table" w:styleId="770">
     <w:name w:val="List Table 2 - Accent 6"/>
-    <w:basedOn w:val="665"/>
+    <w:basedOn w:val="887"/>
     <w:uiPriority w:val="99"/>
     <w:pPr>
       <w:pBdr/>
@@ -17935,9 +18152,9 @@
       </w:tcPr>
     </w:tblStylePr>
   </w:style>
-  <w:style w:type="table" w:styleId="82">
+  <w:style w:type="table" w:styleId="771">
     <w:name w:val="List Table 3"/>
-    <w:basedOn w:val="665"/>
+    <w:basedOn w:val="887"/>
     <w:uiPriority w:val="99"/>
     <w:pPr>
       <w:pBdr/>
@@ -18163,9 +18380,9 @@
       </w:tcPr>
     </w:tblStylePr>
   </w:style>
-  <w:style w:type="table" w:styleId="83">
+  <w:style w:type="table" w:styleId="772">
     <w:name w:val="List Table 3 - Accent 1"/>
-    <w:basedOn w:val="665"/>
+    <w:basedOn w:val="887"/>
     <w:uiPriority w:val="99"/>
     <w:pPr>
       <w:pBdr/>
@@ -18391,9 +18608,9 @@
       </w:tcPr>
     </w:tblStylePr>
   </w:style>
-  <w:style w:type="table" w:styleId="84">
+  <w:style w:type="table" w:styleId="773">
     <w:name w:val="List Table 3 - Accent 2"/>
-    <w:basedOn w:val="665"/>
+    <w:basedOn w:val="887"/>
     <w:uiPriority w:val="99"/>
     <w:pPr>
       <w:pBdr/>
@@ -18619,9 +18836,9 @@
       </w:tcPr>
     </w:tblStylePr>
   </w:style>
-  <w:style w:type="table" w:styleId="85">
+  <w:style w:type="table" w:styleId="774">
     <w:name w:val="List Table 3 - Accent 3"/>
-    <w:basedOn w:val="665"/>
+    <w:basedOn w:val="887"/>
     <w:uiPriority w:val="99"/>
     <w:pPr>
       <w:pBdr/>
@@ -18847,9 +19064,9 @@
       </w:tcPr>
     </w:tblStylePr>
   </w:style>
-  <w:style w:type="table" w:styleId="86">
+  <w:style w:type="table" w:styleId="775">
     <w:name w:val="List Table 3 - Accent 4"/>
-    <w:basedOn w:val="665"/>
+    <w:basedOn w:val="887"/>
     <w:uiPriority w:val="99"/>
     <w:pPr>
       <w:pBdr/>
@@ -19075,9 +19292,9 @@
       </w:tcPr>
     </w:tblStylePr>
   </w:style>
-  <w:style w:type="table" w:styleId="87">
+  <w:style w:type="table" w:styleId="776">
     <w:name w:val="List Table 3 - Accent 5"/>
-    <w:basedOn w:val="665"/>
+    <w:basedOn w:val="887"/>
     <w:uiPriority w:val="99"/>
     <w:pPr>
       <w:pBdr/>
@@ -19303,9 +19520,9 @@
       </w:tcPr>
     </w:tblStylePr>
   </w:style>
-  <w:style w:type="table" w:styleId="88">
+  <w:style w:type="table" w:styleId="777">
     <w:name w:val="List Table 3 - Accent 6"/>
-    <w:basedOn w:val="665"/>
+    <w:basedOn w:val="887"/>
     <w:uiPriority w:val="99"/>
     <w:pPr>
       <w:pBdr/>
@@ -19531,9 +19748,9 @@
       </w:tcPr>
     </w:tblStylePr>
   </w:style>
-  <w:style w:type="table" w:styleId="89">
+  <w:style w:type="table" w:styleId="778">
     <w:name w:val="List Table 4"/>
-    <w:basedOn w:val="665"/>
+    <w:basedOn w:val="887"/>
     <w:uiPriority w:val="99"/>
     <w:pPr>
       <w:pBdr/>
@@ -19756,9 +19973,9 @@
       </w:tcPr>
     </w:tblStylePr>
   </w:style>
-  <w:style w:type="table" w:styleId="90">
+  <w:style w:type="table" w:styleId="779">
     <w:name w:val="List Table 4 - Accent 1"/>
-    <w:basedOn w:val="665"/>
+    <w:basedOn w:val="887"/>
     <w:uiPriority w:val="99"/>
     <w:pPr>
       <w:pBdr/>
@@ -19981,9 +20198,9 @@
       </w:tcPr>
     </w:tblStylePr>
   </w:style>
-  <w:style w:type="table" w:styleId="91">
+  <w:style w:type="table" w:styleId="780">
     <w:name w:val="List Table 4 - Accent 2"/>
-    <w:basedOn w:val="665"/>
+    <w:basedOn w:val="887"/>
     <w:uiPriority w:val="99"/>
     <w:pPr>
       <w:pBdr/>
@@ -20206,9 +20423,9 @@
       </w:tcPr>
     </w:tblStylePr>
   </w:style>
-  <w:style w:type="table" w:styleId="92">
+  <w:style w:type="table" w:styleId="781">
     <w:name w:val="List Table 4 - Accent 3"/>
-    <w:basedOn w:val="665"/>
+    <w:basedOn w:val="887"/>
     <w:uiPriority w:val="99"/>
     <w:pPr>
       <w:pBdr/>
@@ -20431,9 +20648,9 @@
       </w:tcPr>
     </w:tblStylePr>
   </w:style>
-  <w:style w:type="table" w:styleId="93">
+  <w:style w:type="table" w:styleId="782">
     <w:name w:val="List Table 4 - Accent 4"/>
-    <w:basedOn w:val="665"/>
+    <w:basedOn w:val="887"/>
     <w:uiPriority w:val="99"/>
     <w:pPr>
       <w:pBdr/>
@@ -20656,9 +20873,9 @@
       </w:tcPr>
     </w:tblStylePr>
   </w:style>
-  <w:style w:type="table" w:styleId="94">
+  <w:style w:type="table" w:styleId="783">
     <w:name w:val="List Table 4 - Accent 5"/>
-    <w:basedOn w:val="665"/>
+    <w:basedOn w:val="887"/>
     <w:uiPriority w:val="99"/>
     <w:pPr>
       <w:pBdr/>
@@ -20881,9 +21098,9 @@
       </w:tcPr>
     </w:tblStylePr>
   </w:style>
-  <w:style w:type="table" w:styleId="95">
+  <w:style w:type="table" w:styleId="784">
     <w:name w:val="List Table 4 - Accent 6"/>
-    <w:basedOn w:val="665"/>
+    <w:basedOn w:val="887"/>
     <w:uiPriority w:val="99"/>
     <w:pPr>
       <w:pBdr/>
@@ -21106,9 +21323,9 @@
       </w:tcPr>
     </w:tblStylePr>
   </w:style>
-  <w:style w:type="table" w:styleId="96">
+  <w:style w:type="table" w:styleId="785">
     <w:name w:val="List Table 5 Dark"/>
-    <w:basedOn w:val="665"/>
+    <w:basedOn w:val="887"/>
     <w:uiPriority w:val="99"/>
     <w:pPr>
       <w:pBdr/>
@@ -21348,9 +21565,9 @@
       </w:tcPr>
     </w:tblStylePr>
   </w:style>
-  <w:style w:type="table" w:styleId="97">
+  <w:style w:type="table" w:styleId="786">
     <w:name w:val="List Table 5 Dark - Accent 1"/>
-    <w:basedOn w:val="665"/>
+    <w:basedOn w:val="887"/>
     <w:uiPriority w:val="99"/>
     <w:pPr>
       <w:pBdr/>
@@ -21590,9 +21807,9 @@
       </w:tcPr>
     </w:tblStylePr>
   </w:style>
-  <w:style w:type="table" w:styleId="98">
+  <w:style w:type="table" w:styleId="787">
     <w:name w:val="List Table 5 Dark - Accent 2"/>
-    <w:basedOn w:val="665"/>
+    <w:basedOn w:val="887"/>
     <w:uiPriority w:val="99"/>
     <w:pPr>
       <w:pBdr/>
@@ -21832,9 +22049,9 @@
       </w:tcPr>
     </w:tblStylePr>
   </w:style>
-  <w:style w:type="table" w:styleId="99">
+  <w:style w:type="table" w:styleId="788">
     <w:name w:val="List Table 5 Dark - Accent 3"/>
-    <w:basedOn w:val="665"/>
+    <w:basedOn w:val="887"/>
     <w:uiPriority w:val="99"/>
     <w:pPr>
       <w:pBdr/>
@@ -22074,9 +22291,9 @@
       </w:tcPr>
     </w:tblStylePr>
   </w:style>
-  <w:style w:type="table" w:styleId="100">
+  <w:style w:type="table" w:styleId="789">
     <w:name w:val="List Table 5 Dark - Accent 4"/>
-    <w:basedOn w:val="665"/>
+    <w:basedOn w:val="887"/>
     <w:uiPriority w:val="99"/>
     <w:pPr>
       <w:pBdr/>
@@ -22316,9 +22533,9 @@
       </w:tcPr>
     </w:tblStylePr>
   </w:style>
-  <w:style w:type="table" w:styleId="101">
+  <w:style w:type="table" w:styleId="790">
     <w:name w:val="List Table 5 Dark - Accent 5"/>
-    <w:basedOn w:val="665"/>
+    <w:basedOn w:val="887"/>
     <w:uiPriority w:val="99"/>
     <w:pPr>
       <w:pBdr/>
@@ -22558,9 +22775,9 @@
       </w:tcPr>
     </w:tblStylePr>
   </w:style>
-  <w:style w:type="table" w:styleId="102">
+  <w:style w:type="table" w:styleId="791">
     <w:name w:val="List Table 5 Dark - Accent 6"/>
-    <w:basedOn w:val="665"/>
+    <w:basedOn w:val="887"/>
     <w:uiPriority w:val="99"/>
     <w:pPr>
       <w:pBdr/>
@@ -22800,9 +23017,9 @@
       </w:tcPr>
     </w:tblStylePr>
   </w:style>
-  <w:style w:type="table" w:styleId="103">
+  <w:style w:type="table" w:styleId="792">
     <w:name w:val="List Table 6 Colorful"/>
-    <w:basedOn w:val="665"/>
+    <w:basedOn w:val="887"/>
     <w:uiPriority w:val="99"/>
     <w:pPr>
       <w:pBdr/>
@@ -23023,9 +23240,9 @@
       </w:tcPr>
     </w:tblStylePr>
   </w:style>
-  <w:style w:type="table" w:styleId="104">
+  <w:style w:type="table" w:styleId="793">
     <w:name w:val="List Table 6 Colorful - Accent 1"/>
-    <w:basedOn w:val="665"/>
+    <w:basedOn w:val="887"/>
     <w:uiPriority w:val="99"/>
     <w:pPr>
       <w:pBdr/>
@@ -23246,9 +23463,9 @@
       </w:tcPr>
     </w:tblStylePr>
   </w:style>
-  <w:style w:type="table" w:styleId="105">
+  <w:style w:type="table" w:styleId="794">
     <w:name w:val="List Table 6 Colorful - Accent 2"/>
-    <w:basedOn w:val="665"/>
+    <w:basedOn w:val="887"/>
     <w:uiPriority w:val="99"/>
     <w:pPr>
       <w:pBdr/>
@@ -23469,9 +23686,9 @@
       </w:tcPr>
     </w:tblStylePr>
   </w:style>
-  <w:style w:type="table" w:styleId="106">
+  <w:style w:type="table" w:styleId="795">
     <w:name w:val="List Table 6 Colorful - Accent 3"/>
-    <w:basedOn w:val="665"/>
+    <w:basedOn w:val="887"/>
     <w:uiPriority w:val="99"/>
     <w:pPr>
       <w:pBdr/>
@@ -23692,9 +23909,9 @@
       </w:tcPr>
     </w:tblStylePr>
   </w:style>
-  <w:style w:type="table" w:styleId="107">
+  <w:style w:type="table" w:styleId="796">
     <w:name w:val="List Table 6 Colorful - Accent 4"/>
-    <w:basedOn w:val="665"/>
+    <w:basedOn w:val="887"/>
     <w:uiPriority w:val="99"/>
     <w:pPr>
       <w:pBdr/>
@@ -23915,9 +24132,9 @@
       </w:tcPr>
     </w:tblStylePr>
   </w:style>
-  <w:style w:type="table" w:styleId="108">
+  <w:style w:type="table" w:styleId="797">
     <w:name w:val="List Table 6 Colorful - Accent 5"/>
-    <w:basedOn w:val="665"/>
+    <w:basedOn w:val="887"/>
     <w:uiPriority w:val="99"/>
     <w:pPr>
       <w:pBdr/>
@@ -24138,9 +24355,9 @@
       </w:tcPr>
     </w:tblStylePr>
   </w:style>
-  <w:style w:type="table" w:styleId="109">
+  <w:style w:type="table" w:styleId="798">
     <w:name w:val="List Table 6 Colorful - Accent 6"/>
-    <w:basedOn w:val="665"/>
+    <w:basedOn w:val="887"/>
     <w:uiPriority w:val="99"/>
     <w:pPr>
       <w:pBdr/>
@@ -24361,9 +24578,9 @@
       </w:tcPr>
     </w:tblStylePr>
   </w:style>
-  <w:style w:type="table" w:styleId="110">
+  <w:style w:type="table" w:styleId="799">
     <w:name w:val="List Table 7 Colorful"/>
-    <w:basedOn w:val="665"/>
+    <w:basedOn w:val="887"/>
     <w:uiPriority w:val="99"/>
     <w:pPr>
       <w:pBdr/>
@@ -24462,11 +24679,11 @@
         <w:tblBorders/>
       </w:tblPr>
       <w:tcPr>
-        <w:shd w:color="ffffff"/>
+        <w:shd w:val="clear" w:color="ffffff"/>
         <w:tcBorders>
-          <w:top w:val="none"/>
-          <w:left w:val="none"/>
-          <w:bottom w:val="none"/>
+          <w:top w:val="none" w:color="000000" w:sz="4" w:space="0"/>
+          <w:left w:val="none" w:color="000000" w:sz="4" w:space="0"/>
+          <w:bottom w:val="none" w:color="000000" w:sz="4" w:space="0"/>
           <w:right w:val="single" w:color="000000" w:themeColor="text1" w:themeTint="80" w:sz="4" w:space="0"/>
         </w:tcBorders>
       </w:tcPr>
@@ -24489,10 +24706,10 @@
       <w:tcPr>
         <w:shd w:val="clear" w:color="ffffff" w:themeColor="light1" w:fill="ffffff" w:themeFill="light1"/>
         <w:tcBorders>
-          <w:top w:val="none"/>
-          <w:left w:val="none"/>
+          <w:top w:val="none" w:color="000000" w:sz="4" w:space="0"/>
+          <w:left w:val="none" w:color="000000" w:sz="4" w:space="0"/>
           <w:bottom w:val="single" w:color="000000" w:themeColor="text1" w:themeTint="80" w:sz="4" w:space="0"/>
-          <w:right w:val="none"/>
+          <w:right w:val="none" w:color="000000" w:sz="4" w:space="0"/>
         </w:tcBorders>
       </w:tcPr>
     </w:tblStylePr>
@@ -24512,12 +24729,12 @@
         <w:tblBorders/>
       </w:tblPr>
       <w:tcPr>
-        <w:shd w:color="ffffff"/>
+        <w:shd w:val="clear" w:color="ffffff"/>
         <w:tcBorders>
-          <w:top w:val="none"/>
+          <w:top w:val="none" w:color="000000" w:sz="4" w:space="0"/>
           <w:left w:val="single" w:color="000000" w:themeColor="text1" w:themeTint="80" w:sz="4" w:space="0"/>
-          <w:bottom w:val="none"/>
-          <w:right w:val="none"/>
+          <w:bottom w:val="none" w:color="000000" w:sz="4" w:space="0"/>
+          <w:right w:val="none" w:color="000000" w:sz="4" w:space="0"/>
         </w:tcBorders>
       </w:tcPr>
     </w:tblStylePr>
@@ -24540,9 +24757,9 @@
         <w:shd w:val="clear" w:color="ffffff" w:themeColor="light1" w:fill="ffffff" w:themeFill="light1"/>
         <w:tcBorders>
           <w:top w:val="single" w:color="000000" w:themeColor="text1" w:themeTint="80" w:sz="4" w:space="0"/>
-          <w:left w:val="none"/>
-          <w:bottom w:val="none"/>
-          <w:right w:val="none"/>
+          <w:left w:val="none" w:color="000000" w:sz="4" w:space="0"/>
+          <w:bottom w:val="none" w:color="000000" w:sz="4" w:space="0"/>
+          <w:right w:val="none" w:color="000000" w:sz="4" w:space="0"/>
         </w:tcBorders>
       </w:tcPr>
     </w:tblStylePr>
@@ -24617,9 +24834,9 @@
       </w:tcPr>
     </w:tblStylePr>
   </w:style>
-  <w:style w:type="table" w:styleId="111">
+  <w:style w:type="table" w:styleId="800">
     <w:name w:val="List Table 7 Colorful - Accent 1"/>
-    <w:basedOn w:val="665"/>
+    <w:basedOn w:val="887"/>
     <w:uiPriority w:val="99"/>
     <w:pPr>
       <w:pBdr/>
@@ -24718,11 +24935,11 @@
         <w:tblBorders/>
       </w:tblPr>
       <w:tcPr>
-        <w:shd w:color="ffffff"/>
+        <w:shd w:val="clear" w:color="ffffff"/>
         <w:tcBorders>
-          <w:top w:val="none"/>
-          <w:left w:val="none"/>
-          <w:bottom w:val="none"/>
+          <w:top w:val="none" w:color="000000" w:sz="4" w:space="0"/>
+          <w:left w:val="none" w:color="000000" w:sz="4" w:space="0"/>
+          <w:bottom w:val="none" w:color="000000" w:sz="4" w:space="0"/>
           <w:right w:val="single" w:color="000000" w:themeColor="accent1" w:sz="4" w:space="0"/>
         </w:tcBorders>
       </w:tcPr>
@@ -24745,10 +24962,10 @@
       <w:tcPr>
         <w:shd w:val="clear" w:color="ffffff" w:themeColor="light1" w:fill="ffffff" w:themeFill="light1"/>
         <w:tcBorders>
-          <w:top w:val="none"/>
-          <w:left w:val="none"/>
+          <w:top w:val="none" w:color="000000" w:sz="4" w:space="0"/>
+          <w:left w:val="none" w:color="000000" w:sz="4" w:space="0"/>
           <w:bottom w:val="single" w:color="000000" w:themeColor="accent1" w:sz="4" w:space="0"/>
-          <w:right w:val="none"/>
+          <w:right w:val="none" w:color="000000" w:sz="4" w:space="0"/>
         </w:tcBorders>
       </w:tcPr>
     </w:tblStylePr>
@@ -24768,12 +24985,12 @@
         <w:tblBorders/>
       </w:tblPr>
       <w:tcPr>
-        <w:shd w:color="ffffff"/>
+        <w:shd w:val="clear" w:color="ffffff"/>
         <w:tcBorders>
-          <w:top w:val="none"/>
+          <w:top w:val="none" w:color="000000" w:sz="4" w:space="0"/>
           <w:left w:val="single" w:color="000000" w:themeColor="accent1" w:sz="4" w:space="0"/>
-          <w:bottom w:val="none"/>
-          <w:right w:val="none"/>
+          <w:bottom w:val="none" w:color="000000" w:sz="4" w:space="0"/>
+          <w:right w:val="none" w:color="000000" w:sz="4" w:space="0"/>
         </w:tcBorders>
       </w:tcPr>
     </w:tblStylePr>
@@ -24796,9 +25013,9 @@
         <w:shd w:val="clear" w:color="ffffff" w:themeColor="light1" w:fill="ffffff" w:themeFill="light1"/>
         <w:tcBorders>
           <w:top w:val="single" w:color="000000" w:themeColor="accent1" w:sz="4" w:space="0"/>
-          <w:left w:val="none"/>
-          <w:bottom w:val="none"/>
-          <w:right w:val="none"/>
+          <w:left w:val="none" w:color="000000" w:sz="4" w:space="0"/>
+          <w:bottom w:val="none" w:color="000000" w:sz="4" w:space="0"/>
+          <w:right w:val="none" w:color="000000" w:sz="4" w:space="0"/>
         </w:tcBorders>
       </w:tcPr>
     </w:tblStylePr>
@@ -24873,9 +25090,9 @@
       </w:tcPr>
     </w:tblStylePr>
   </w:style>
-  <w:style w:type="table" w:styleId="112">
+  <w:style w:type="table" w:styleId="801">
     <w:name w:val="List Table 7 Colorful - Accent 2"/>
-    <w:basedOn w:val="665"/>
+    <w:basedOn w:val="887"/>
     <w:uiPriority w:val="99"/>
     <w:pPr>
       <w:pBdr/>
@@ -24974,11 +25191,11 @@
         <w:tblBorders/>
       </w:tblPr>
       <w:tcPr>
-        <w:shd w:color="ffffff"/>
+        <w:shd w:val="clear" w:color="ffffff"/>
         <w:tcBorders>
-          <w:top w:val="none"/>
-          <w:left w:val="none"/>
-          <w:bottom w:val="none"/>
+          <w:top w:val="none" w:color="000000" w:sz="4" w:space="0"/>
+          <w:left w:val="none" w:color="000000" w:sz="4" w:space="0"/>
+          <w:bottom w:val="none" w:color="000000" w:sz="4" w:space="0"/>
           <w:right w:val="single" w:color="000000" w:themeColor="accent2" w:themeTint="97" w:sz="4" w:space="0"/>
         </w:tcBorders>
       </w:tcPr>
@@ -25001,10 +25218,10 @@
       <w:tcPr>
         <w:shd w:val="clear" w:color="ffffff" w:themeColor="light1" w:fill="ffffff" w:themeFill="light1"/>
         <w:tcBorders>
-          <w:top w:val="none"/>
-          <w:left w:val="none"/>
+          <w:top w:val="none" w:color="000000" w:sz="4" w:space="0"/>
+          <w:left w:val="none" w:color="000000" w:sz="4" w:space="0"/>
           <w:bottom w:val="single" w:color="000000" w:themeColor="accent2" w:themeTint="97" w:sz="4" w:space="0"/>
-          <w:right w:val="none"/>
+          <w:right w:val="none" w:color="000000" w:sz="4" w:space="0"/>
         </w:tcBorders>
       </w:tcPr>
     </w:tblStylePr>
@@ -25024,12 +25241,12 @@
         <w:tblBorders/>
       </w:tblPr>
       <w:tcPr>
-        <w:shd w:color="ffffff"/>
+        <w:shd w:val="clear" w:color="ffffff"/>
         <w:tcBorders>
-          <w:top w:val="none"/>
+          <w:top w:val="none" w:color="000000" w:sz="4" w:space="0"/>
           <w:left w:val="single" w:color="000000" w:themeColor="accent2" w:themeTint="97" w:sz="4" w:space="0"/>
-          <w:bottom w:val="none"/>
-          <w:right w:val="none"/>
+          <w:bottom w:val="none" w:color="000000" w:sz="4" w:space="0"/>
+          <w:right w:val="none" w:color="000000" w:sz="4" w:space="0"/>
         </w:tcBorders>
       </w:tcPr>
     </w:tblStylePr>
@@ -25052,9 +25269,9 @@
         <w:shd w:val="clear" w:color="ffffff" w:themeColor="light1" w:fill="ffffff" w:themeFill="light1"/>
         <w:tcBorders>
           <w:top w:val="single" w:color="000000" w:themeColor="accent2" w:themeTint="97" w:sz="4" w:space="0"/>
-          <w:left w:val="none"/>
-          <w:bottom w:val="none"/>
-          <w:right w:val="none"/>
+          <w:left w:val="none" w:color="000000" w:sz="4" w:space="0"/>
+          <w:bottom w:val="none" w:color="000000" w:sz="4" w:space="0"/>
+          <w:right w:val="none" w:color="000000" w:sz="4" w:space="0"/>
         </w:tcBorders>
       </w:tcPr>
     </w:tblStylePr>
@@ -25129,9 +25346,9 @@
       </w:tcPr>
     </w:tblStylePr>
   </w:style>
-  <w:style w:type="table" w:styleId="113">
+  <w:style w:type="table" w:styleId="802">
     <w:name w:val="List Table 7 Colorful - Accent 3"/>
-    <w:basedOn w:val="665"/>
+    <w:basedOn w:val="887"/>
     <w:uiPriority w:val="99"/>
     <w:pPr>
       <w:pBdr/>
@@ -25230,11 +25447,11 @@
         <w:tblBorders/>
       </w:tblPr>
       <w:tcPr>
-        <w:shd w:color="ffffff"/>
+        <w:shd w:val="clear" w:color="ffffff"/>
         <w:tcBorders>
-          <w:top w:val="none"/>
-          <w:left w:val="none"/>
-          <w:bottom w:val="none"/>
+          <w:top w:val="none" w:color="000000" w:sz="4" w:space="0"/>
+          <w:left w:val="none" w:color="000000" w:sz="4" w:space="0"/>
+          <w:bottom w:val="none" w:color="000000" w:sz="4" w:space="0"/>
           <w:right w:val="single" w:color="000000" w:themeColor="accent3" w:themeTint="98" w:sz="4" w:space="0"/>
         </w:tcBorders>
       </w:tcPr>
@@ -25257,10 +25474,10 @@
       <w:tcPr>
         <w:shd w:val="clear" w:color="ffffff" w:themeColor="light1" w:fill="ffffff" w:themeFill="light1"/>
         <w:tcBorders>
-          <w:top w:val="none"/>
-          <w:left w:val="none"/>
+          <w:top w:val="none" w:color="000000" w:sz="4" w:space="0"/>
+          <w:left w:val="none" w:color="000000" w:sz="4" w:space="0"/>
           <w:bottom w:val="single" w:color="000000" w:themeColor="accent3" w:themeTint="98" w:sz="4" w:space="0"/>
-          <w:right w:val="none"/>
+          <w:right w:val="none" w:color="000000" w:sz="4" w:space="0"/>
         </w:tcBorders>
       </w:tcPr>
     </w:tblStylePr>
@@ -25280,12 +25497,12 @@
         <w:tblBorders/>
       </w:tblPr>
       <w:tcPr>
-        <w:shd w:color="ffffff"/>
+        <w:shd w:val="clear" w:color="ffffff"/>
         <w:tcBorders>
-          <w:top w:val="none"/>
+          <w:top w:val="none" w:color="000000" w:sz="4" w:space="0"/>
           <w:left w:val="single" w:color="000000" w:themeColor="accent3" w:themeTint="98" w:sz="4" w:space="0"/>
-          <w:bottom w:val="none"/>
-          <w:right w:val="none"/>
+          <w:bottom w:val="none" w:color="000000" w:sz="4" w:space="0"/>
+          <w:right w:val="none" w:color="000000" w:sz="4" w:space="0"/>
         </w:tcBorders>
       </w:tcPr>
     </w:tblStylePr>
@@ -25308,9 +25525,9 @@
         <w:shd w:val="clear" w:color="ffffff" w:themeColor="light1" w:fill="ffffff" w:themeFill="light1"/>
         <w:tcBorders>
           <w:top w:val="single" w:color="000000" w:themeColor="accent3" w:themeTint="98" w:sz="4" w:space="0"/>
-          <w:left w:val="none"/>
-          <w:bottom w:val="none"/>
-          <w:right w:val="none"/>
+          <w:left w:val="none" w:color="000000" w:sz="4" w:space="0"/>
+          <w:bottom w:val="none" w:color="000000" w:sz="4" w:space="0"/>
+          <w:right w:val="none" w:color="000000" w:sz="4" w:space="0"/>
         </w:tcBorders>
       </w:tcPr>
     </w:tblStylePr>
@@ -25385,9 +25602,9 @@
       </w:tcPr>
     </w:tblStylePr>
   </w:style>
-  <w:style w:type="table" w:styleId="114">
+  <w:style w:type="table" w:styleId="803">
     <w:name w:val="List Table 7 Colorful - Accent 4"/>
-    <w:basedOn w:val="665"/>
+    <w:basedOn w:val="887"/>
     <w:uiPriority w:val="99"/>
     <w:pPr>
       <w:pBdr/>
@@ -25486,11 +25703,11 @@
         <w:tblBorders/>
       </w:tblPr>
       <w:tcPr>
-        <w:shd w:color="ffffff"/>
+        <w:shd w:val="clear" w:color="ffffff"/>
         <w:tcBorders>
-          <w:top w:val="none"/>
-          <w:left w:val="none"/>
-          <w:bottom w:val="none"/>
+          <w:top w:val="none" w:color="000000" w:sz="4" w:space="0"/>
+          <w:left w:val="none" w:color="000000" w:sz="4" w:space="0"/>
+          <w:bottom w:val="none" w:color="000000" w:sz="4" w:space="0"/>
           <w:right w:val="single" w:color="000000" w:themeColor="accent4" w:themeTint="9A" w:sz="4" w:space="0"/>
         </w:tcBorders>
       </w:tcPr>
@@ -25513,10 +25730,10 @@
       <w:tcPr>
         <w:shd w:val="clear" w:color="ffffff" w:themeColor="light1" w:fill="ffffff" w:themeFill="light1"/>
         <w:tcBorders>
-          <w:top w:val="none"/>
-          <w:left w:val="none"/>
+          <w:top w:val="none" w:color="000000" w:sz="4" w:space="0"/>
+          <w:left w:val="none" w:color="000000" w:sz="4" w:space="0"/>
           <w:bottom w:val="single" w:color="000000" w:themeColor="accent4" w:themeTint="9A" w:sz="4" w:space="0"/>
-          <w:right w:val="none"/>
+          <w:right w:val="none" w:color="000000" w:sz="4" w:space="0"/>
         </w:tcBorders>
       </w:tcPr>
     </w:tblStylePr>
@@ -25536,12 +25753,12 @@
         <w:tblBorders/>
       </w:tblPr>
       <w:tcPr>
-        <w:shd w:color="ffffff"/>
+        <w:shd w:val="clear" w:color="ffffff"/>
         <w:tcBorders>
-          <w:top w:val="none"/>
+          <w:top w:val="none" w:color="000000" w:sz="4" w:space="0"/>
           <w:left w:val="single" w:color="000000" w:themeColor="accent4" w:themeTint="9A" w:sz="4" w:space="0"/>
-          <w:bottom w:val="none"/>
-          <w:right w:val="none"/>
+          <w:bottom w:val="none" w:color="000000" w:sz="4" w:space="0"/>
+          <w:right w:val="none" w:color="000000" w:sz="4" w:space="0"/>
         </w:tcBorders>
       </w:tcPr>
     </w:tblStylePr>
@@ -25564,9 +25781,9 @@
         <w:shd w:val="clear" w:color="ffffff" w:themeColor="light1" w:fill="ffffff" w:themeFill="light1"/>
         <w:tcBorders>
           <w:top w:val="single" w:color="000000" w:themeColor="accent4" w:themeTint="9A" w:sz="4" w:space="0"/>
-          <w:left w:val="none"/>
-          <w:bottom w:val="none"/>
-          <w:right w:val="none"/>
+          <w:left w:val="none" w:color="000000" w:sz="4" w:space="0"/>
+          <w:bottom w:val="none" w:color="000000" w:sz="4" w:space="0"/>
+          <w:right w:val="none" w:color="000000" w:sz="4" w:space="0"/>
         </w:tcBorders>
       </w:tcPr>
     </w:tblStylePr>
@@ -25641,9 +25858,9 @@
       </w:tcPr>
     </w:tblStylePr>
   </w:style>
-  <w:style w:type="table" w:styleId="115">
+  <w:style w:type="table" w:styleId="804">
     <w:name w:val="List Table 7 Colorful - Accent 5"/>
-    <w:basedOn w:val="665"/>
+    <w:basedOn w:val="887"/>
     <w:uiPriority w:val="99"/>
     <w:pPr>
       <w:pBdr/>
@@ -25742,11 +25959,11 @@
         <w:tblBorders/>
       </w:tblPr>
       <w:tcPr>
-        <w:shd w:color="ffffff"/>
+        <w:shd w:val="clear" w:color="ffffff"/>
         <w:tcBorders>
-          <w:top w:val="none"/>
-          <w:left w:val="none"/>
-          <w:bottom w:val="none"/>
+          <w:top w:val="none" w:color="000000" w:sz="4" w:space="0"/>
+          <w:left w:val="none" w:color="000000" w:sz="4" w:space="0"/>
+          <w:bottom w:val="none" w:color="000000" w:sz="4" w:space="0"/>
           <w:right w:val="single" w:color="000000" w:themeColor="accent5" w:themeTint="9A" w:sz="4" w:space="0"/>
         </w:tcBorders>
       </w:tcPr>
@@ -25769,10 +25986,10 @@
       <w:tcPr>
         <w:shd w:val="clear" w:color="ffffff" w:themeColor="light1" w:fill="ffffff" w:themeFill="light1"/>
         <w:tcBorders>
-          <w:top w:val="none"/>
-          <w:left w:val="none"/>
+          <w:top w:val="none" w:color="000000" w:sz="4" w:space="0"/>
+          <w:left w:val="none" w:color="000000" w:sz="4" w:space="0"/>
           <w:bottom w:val="single" w:color="000000" w:themeColor="accent5" w:themeTint="9A" w:sz="4" w:space="0"/>
-          <w:right w:val="none"/>
+          <w:right w:val="none" w:color="000000" w:sz="4" w:space="0"/>
         </w:tcBorders>
       </w:tcPr>
     </w:tblStylePr>
@@ -25792,12 +26009,12 @@
         <w:tblBorders/>
       </w:tblPr>
       <w:tcPr>
-        <w:shd w:color="ffffff"/>
+        <w:shd w:val="clear" w:color="ffffff"/>
         <w:tcBorders>
-          <w:top w:val="none"/>
+          <w:top w:val="none" w:color="000000" w:sz="4" w:space="0"/>
           <w:left w:val="single" w:color="000000" w:themeColor="accent5" w:themeTint="9A" w:sz="4" w:space="0"/>
-          <w:bottom w:val="none"/>
-          <w:right w:val="none"/>
+          <w:bottom w:val="none" w:color="000000" w:sz="4" w:space="0"/>
+          <w:right w:val="none" w:color="000000" w:sz="4" w:space="0"/>
         </w:tcBorders>
       </w:tcPr>
     </w:tblStylePr>
@@ -25820,9 +26037,9 @@
         <w:shd w:val="clear" w:color="ffffff" w:themeColor="light1" w:fill="ffffff" w:themeFill="light1"/>
         <w:tcBorders>
           <w:top w:val="single" w:color="000000" w:themeColor="accent5" w:themeTint="9A" w:sz="4" w:space="0"/>
-          <w:left w:val="none"/>
-          <w:bottom w:val="none"/>
-          <w:right w:val="none"/>
+          <w:left w:val="none" w:color="000000" w:sz="4" w:space="0"/>
+          <w:bottom w:val="none" w:color="000000" w:sz="4" w:space="0"/>
+          <w:right w:val="none" w:color="000000" w:sz="4" w:space="0"/>
         </w:tcBorders>
       </w:tcPr>
     </w:tblStylePr>
@@ -25897,9 +26114,9 @@
       </w:tcPr>
     </w:tblStylePr>
   </w:style>
-  <w:style w:type="table" w:styleId="116">
+  <w:style w:type="table" w:styleId="805">
     <w:name w:val="List Table 7 Colorful - Accent 6"/>
-    <w:basedOn w:val="665"/>
+    <w:basedOn w:val="887"/>
     <w:uiPriority w:val="99"/>
     <w:pPr>
       <w:pBdr/>
@@ -25998,11 +26215,11 @@
         <w:tblBorders/>
       </w:tblPr>
       <w:tcPr>
-        <w:shd w:color="ffffff"/>
+        <w:shd w:val="clear" w:color="ffffff"/>
         <w:tcBorders>
-          <w:top w:val="none"/>
-          <w:left w:val="none"/>
-          <w:bottom w:val="none"/>
+          <w:top w:val="none" w:color="000000" w:sz="4" w:space="0"/>
+          <w:left w:val="none" w:color="000000" w:sz="4" w:space="0"/>
+          <w:bottom w:val="none" w:color="000000" w:sz="4" w:space="0"/>
           <w:right w:val="single" w:color="000000" w:themeColor="accent6" w:themeTint="98" w:sz="4" w:space="0"/>
         </w:tcBorders>
       </w:tcPr>
@@ -26025,10 +26242,10 @@
       <w:tcPr>
         <w:shd w:val="clear" w:color="ffffff" w:themeColor="light1" w:fill="ffffff" w:themeFill="light1"/>
         <w:tcBorders>
-          <w:top w:val="none"/>
-          <w:left w:val="none"/>
+          <w:top w:val="none" w:color="000000" w:sz="4" w:space="0"/>
+          <w:left w:val="none" w:color="000000" w:sz="4" w:space="0"/>
           <w:bottom w:val="single" w:color="000000" w:themeColor="accent6" w:themeTint="98" w:sz="4" w:space="0"/>
-          <w:right w:val="none"/>
+          <w:right w:val="none" w:color="000000" w:sz="4" w:space="0"/>
         </w:tcBorders>
       </w:tcPr>
     </w:tblStylePr>
@@ -26048,12 +26265,12 @@
         <w:tblBorders/>
       </w:tblPr>
       <w:tcPr>
-        <w:shd w:color="ffffff"/>
+        <w:shd w:val="clear" w:color="ffffff"/>
         <w:tcBorders>
-          <w:top w:val="none"/>
+          <w:top w:val="none" w:color="000000" w:sz="4" w:space="0"/>
           <w:left w:val="single" w:color="000000" w:themeColor="accent6" w:themeTint="98" w:sz="4" w:space="0"/>
-          <w:bottom w:val="none"/>
-          <w:right w:val="none"/>
+          <w:bottom w:val="none" w:color="000000" w:sz="4" w:space="0"/>
+          <w:right w:val="none" w:color="000000" w:sz="4" w:space="0"/>
         </w:tcBorders>
       </w:tcPr>
     </w:tblStylePr>
@@ -26076,9 +26293,9 @@
         <w:shd w:val="clear" w:color="ffffff" w:themeColor="light1" w:fill="ffffff" w:themeFill="light1"/>
         <w:tcBorders>
           <w:top w:val="single" w:color="000000" w:themeColor="accent6" w:themeTint="98" w:sz="4" w:space="0"/>
-          <w:left w:val="none"/>
-          <w:bottom w:val="none"/>
-          <w:right w:val="none"/>
+          <w:left w:val="none" w:color="000000" w:sz="4" w:space="0"/>
+          <w:bottom w:val="none" w:color="000000" w:sz="4" w:space="0"/>
+          <w:right w:val="none" w:color="000000" w:sz="4" w:space="0"/>
         </w:tcBorders>
       </w:tcPr>
     </w:tblStylePr>
@@ -26153,9 +26370,9 @@
       </w:tcPr>
     </w:tblStylePr>
   </w:style>
-  <w:style w:type="table" w:styleId="117">
+  <w:style w:type="table" w:styleId="806">
     <w:name w:val="Lined - Accent"/>
-    <w:basedOn w:val="665"/>
+    <w:basedOn w:val="887"/>
     <w:uiPriority w:val="99"/>
     <w:pPr>
       <w:pBdr/>
@@ -26390,9 +26607,9 @@
       </w:tcPr>
     </w:tblStylePr>
   </w:style>
-  <w:style w:type="table" w:styleId="118">
+  <w:style w:type="table" w:styleId="807">
     <w:name w:val="Lined - Accent 1"/>
-    <w:basedOn w:val="665"/>
+    <w:basedOn w:val="887"/>
     <w:uiPriority w:val="99"/>
     <w:pPr>
       <w:pBdr/>
@@ -26627,9 +26844,9 @@
       </w:tcPr>
     </w:tblStylePr>
   </w:style>
-  <w:style w:type="table" w:styleId="119">
+  <w:style w:type="table" w:styleId="808">
     <w:name w:val="Lined - Accent 2"/>
-    <w:basedOn w:val="665"/>
+    <w:basedOn w:val="887"/>
     <w:uiPriority w:val="99"/>
     <w:pPr>
       <w:pBdr/>
@@ -26864,9 +27081,9 @@
       </w:tcPr>
     </w:tblStylePr>
   </w:style>
-  <w:style w:type="table" w:styleId="120">
+  <w:style w:type="table" w:styleId="809">
     <w:name w:val="Lined - Accent 3"/>
-    <w:basedOn w:val="665"/>
+    <w:basedOn w:val="887"/>
     <w:uiPriority w:val="99"/>
     <w:pPr>
       <w:pBdr/>
@@ -27101,9 +27318,9 @@
       </w:tcPr>
     </w:tblStylePr>
   </w:style>
-  <w:style w:type="table" w:styleId="121">
+  <w:style w:type="table" w:styleId="810">
     <w:name w:val="Lined - Accent 4"/>
-    <w:basedOn w:val="665"/>
+    <w:basedOn w:val="887"/>
     <w:uiPriority w:val="99"/>
     <w:pPr>
       <w:pBdr/>
@@ -27338,9 +27555,9 @@
       </w:tcPr>
     </w:tblStylePr>
   </w:style>
-  <w:style w:type="table" w:styleId="122">
+  <w:style w:type="table" w:styleId="811">
     <w:name w:val="Lined - Accent 5"/>
-    <w:basedOn w:val="665"/>
+    <w:basedOn w:val="887"/>
     <w:uiPriority w:val="99"/>
     <w:pPr>
       <w:pBdr/>
@@ -27575,9 +27792,9 @@
       </w:tcPr>
     </w:tblStylePr>
   </w:style>
-  <w:style w:type="table" w:styleId="123">
+  <w:style w:type="table" w:styleId="812">
     <w:name w:val="Lined - Accent 6"/>
-    <w:basedOn w:val="665"/>
+    <w:basedOn w:val="887"/>
     <w:uiPriority w:val="99"/>
     <w:pPr>
       <w:pBdr/>
@@ -27812,9 +28029,9 @@
       </w:tcPr>
     </w:tblStylePr>
   </w:style>
-  <w:style w:type="table" w:styleId="124">
+  <w:style w:type="table" w:styleId="813">
     <w:name w:val="Bordered &amp; Lined - Accent"/>
-    <w:basedOn w:val="665"/>
+    <w:basedOn w:val="887"/>
     <w:uiPriority w:val="99"/>
     <w:pPr>
       <w:pBdr/>
@@ -28056,9 +28273,9 @@
       </w:tcPr>
     </w:tblStylePr>
   </w:style>
-  <w:style w:type="table" w:styleId="125">
+  <w:style w:type="table" w:styleId="814">
     <w:name w:val="Bordered &amp; Lined - Accent 1"/>
-    <w:basedOn w:val="665"/>
+    <w:basedOn w:val="887"/>
     <w:uiPriority w:val="99"/>
     <w:pPr>
       <w:pBdr/>
@@ -28300,9 +28517,9 @@
       </w:tcPr>
     </w:tblStylePr>
   </w:style>
-  <w:style w:type="table" w:styleId="126">
+  <w:style w:type="table" w:styleId="815">
     <w:name w:val="Bordered &amp; Lined - Accent 2"/>
-    <w:basedOn w:val="665"/>
+    <w:basedOn w:val="887"/>
     <w:uiPriority w:val="99"/>
     <w:pPr>
       <w:pBdr/>
@@ -28544,9 +28761,9 @@
       </w:tcPr>
     </w:tblStylePr>
   </w:style>
-  <w:style w:type="table" w:styleId="127">
+  <w:style w:type="table" w:styleId="816">
     <w:name w:val="Bordered &amp; Lined - Accent 3"/>
-    <w:basedOn w:val="665"/>
+    <w:basedOn w:val="887"/>
     <w:uiPriority w:val="99"/>
     <w:pPr>
       <w:pBdr/>
@@ -28788,9 +29005,9 @@
       </w:tcPr>
     </w:tblStylePr>
   </w:style>
-  <w:style w:type="table" w:styleId="128">
+  <w:style w:type="table" w:styleId="817">
     <w:name w:val="Bordered &amp; Lined - Accent 4"/>
-    <w:basedOn w:val="665"/>
+    <w:basedOn w:val="887"/>
     <w:uiPriority w:val="99"/>
     <w:pPr>
       <w:pBdr/>
@@ -29032,9 +29249,9 @@
       </w:tcPr>
     </w:tblStylePr>
   </w:style>
-  <w:style w:type="table" w:styleId="129">
+  <w:style w:type="table" w:styleId="818">
     <w:name w:val="Bordered &amp; Lined - Accent 5"/>
-    <w:basedOn w:val="665"/>
+    <w:basedOn w:val="887"/>
     <w:uiPriority w:val="99"/>
     <w:pPr>
       <w:pBdr/>
@@ -29276,9 +29493,9 @@
       </w:tcPr>
     </w:tblStylePr>
   </w:style>
-  <w:style w:type="table" w:styleId="130">
+  <w:style w:type="table" w:styleId="819">
     <w:name w:val="Bordered &amp; Lined - Accent 6"/>
-    <w:basedOn w:val="665"/>
+    <w:basedOn w:val="887"/>
     <w:uiPriority w:val="99"/>
     <w:pPr>
       <w:pBdr/>
@@ -29520,9 +29737,9 @@
       </w:tcPr>
     </w:tblStylePr>
   </w:style>
-  <w:style w:type="table" w:styleId="131">
+  <w:style w:type="table" w:styleId="820">
     <w:name w:val="Bordered"/>
-    <w:basedOn w:val="665"/>
+    <w:basedOn w:val="887"/>
     <w:uiPriority w:val="99"/>
     <w:pPr>
       <w:pBdr/>
@@ -29751,9 +29968,9 @@
       </w:tcPr>
     </w:tblStylePr>
   </w:style>
-  <w:style w:type="table" w:styleId="132">
+  <w:style w:type="table" w:styleId="821">
     <w:name w:val="Bordered - Accent 1"/>
-    <w:basedOn w:val="665"/>
+    <w:basedOn w:val="887"/>
     <w:uiPriority w:val="99"/>
     <w:pPr>
       <w:pBdr/>
@@ -29982,9 +30199,9 @@
       </w:tcPr>
     </w:tblStylePr>
   </w:style>
-  <w:style w:type="table" w:styleId="133">
+  <w:style w:type="table" w:styleId="822">
     <w:name w:val="Bordered - Accent 2"/>
-    <w:basedOn w:val="665"/>
+    <w:basedOn w:val="887"/>
     <w:uiPriority w:val="99"/>
     <w:pPr>
       <w:pBdr/>
@@ -30213,9 +30430,9 @@
       </w:tcPr>
     </w:tblStylePr>
   </w:style>
-  <w:style w:type="table" w:styleId="134">
+  <w:style w:type="table" w:styleId="823">
     <w:name w:val="Bordered - Accent 3"/>
-    <w:basedOn w:val="665"/>
+    <w:basedOn w:val="887"/>
     <w:uiPriority w:val="99"/>
     <w:pPr>
       <w:pBdr/>
@@ -30444,9 +30661,9 @@
       </w:tcPr>
     </w:tblStylePr>
   </w:style>
-  <w:style w:type="table" w:styleId="135">
+  <w:style w:type="table" w:styleId="824">
     <w:name w:val="Bordered - Accent 4"/>
-    <w:basedOn w:val="665"/>
+    <w:basedOn w:val="887"/>
     <w:uiPriority w:val="99"/>
     <w:pPr>
       <w:pBdr/>
@@ -30675,9 +30892,9 @@
       </w:tcPr>
     </w:tblStylePr>
   </w:style>
-  <w:style w:type="table" w:styleId="136">
+  <w:style w:type="table" w:styleId="825">
     <w:name w:val="Bordered - Accent 5"/>
-    <w:basedOn w:val="665"/>
+    <w:basedOn w:val="887"/>
     <w:uiPriority w:val="99"/>
     <w:pPr>
       <w:pBdr/>
@@ -30906,9 +31123,9 @@
       </w:tcPr>
     </w:tblStylePr>
   </w:style>
-  <w:style w:type="table" w:styleId="137">
+  <w:style w:type="table" w:styleId="826">
     <w:name w:val="Bordered - Accent 6"/>
-    <w:basedOn w:val="665"/>
+    <w:basedOn w:val="887"/>
     <w:uiPriority w:val="99"/>
     <w:pPr>
       <w:pBdr/>
@@ -31137,11 +31354,11 @@
       </w:tcPr>
     </w:tblStylePr>
   </w:style>
-  <w:style w:type="paragraph" w:styleId="139">
+  <w:style w:type="paragraph" w:styleId="827">
     <w:name w:val="Heading 1"/>
-    <w:basedOn w:val="664"/>
-    <w:next w:val="664"/>
-    <w:link w:val="150"/>
+    <w:basedOn w:val="886"/>
+    <w:next w:val="886"/>
+    <w:link w:val="837"/>
     <w:uiPriority w:val="9"/>
     <w:qFormat/>
     <w:pPr>
@@ -31159,11 +31376,11 @@
       <w:szCs w:val="40"/>
     </w:rPr>
   </w:style>
-  <w:style w:type="paragraph" w:styleId="140">
+  <w:style w:type="paragraph" w:styleId="828">
     <w:name w:val="Heading 2"/>
-    <w:basedOn w:val="664"/>
-    <w:next w:val="664"/>
-    <w:link w:val="151"/>
+    <w:basedOn w:val="886"/>
+    <w:next w:val="886"/>
+    <w:link w:val="838"/>
     <w:uiPriority w:val="9"/>
     <w:unhideWhenUsed/>
     <w:qFormat/>
@@ -31182,11 +31399,11 @@
       <w:szCs w:val="32"/>
     </w:rPr>
   </w:style>
-  <w:style w:type="paragraph" w:styleId="141">
+  <w:style w:type="paragraph" w:styleId="829">
     <w:name w:val="Heading 3"/>
-    <w:basedOn w:val="664"/>
-    <w:next w:val="664"/>
-    <w:link w:val="152"/>
+    <w:basedOn w:val="886"/>
+    <w:next w:val="886"/>
+    <w:link w:val="839"/>
     <w:uiPriority w:val="9"/>
     <w:unhideWhenUsed/>
     <w:qFormat/>
@@ -31205,11 +31422,11 @@
       <w:szCs w:val="28"/>
     </w:rPr>
   </w:style>
-  <w:style w:type="paragraph" w:styleId="142">
+  <w:style w:type="paragraph" w:styleId="830">
     <w:name w:val="Heading 4"/>
-    <w:basedOn w:val="664"/>
-    <w:next w:val="664"/>
-    <w:link w:val="153"/>
+    <w:basedOn w:val="886"/>
+    <w:next w:val="886"/>
+    <w:link w:val="840"/>
     <w:uiPriority w:val="9"/>
     <w:unhideWhenUsed/>
     <w:qFormat/>
@@ -31228,11 +31445,11 @@
       <w:color w:val="0f4761" w:themeColor="accent1" w:themeShade="BF"/>
     </w:rPr>
   </w:style>
-  <w:style w:type="paragraph" w:styleId="143">
+  <w:style w:type="paragraph" w:styleId="831">
     <w:name w:val="Heading 5"/>
-    <w:basedOn w:val="664"/>
-    <w:next w:val="664"/>
-    <w:link w:val="154"/>
+    <w:basedOn w:val="886"/>
+    <w:next w:val="886"/>
+    <w:link w:val="841"/>
     <w:uiPriority w:val="9"/>
     <w:unhideWhenUsed/>
     <w:qFormat/>
@@ -31249,11 +31466,11 @@
       <w:color w:val="0f4761" w:themeColor="accent1" w:themeShade="BF"/>
     </w:rPr>
   </w:style>
-  <w:style w:type="paragraph" w:styleId="144">
+  <w:style w:type="paragraph" w:styleId="832">
     <w:name w:val="Heading 6"/>
-    <w:basedOn w:val="664"/>
-    <w:next w:val="664"/>
-    <w:link w:val="155"/>
+    <w:basedOn w:val="886"/>
+    <w:next w:val="886"/>
+    <w:link w:val="842"/>
     <w:uiPriority w:val="9"/>
     <w:unhideWhenUsed/>
     <w:qFormat/>
@@ -31272,11 +31489,11 @@
       <w:color w:val="595959" w:themeColor="text1" w:themeTint="A6"/>
     </w:rPr>
   </w:style>
-  <w:style w:type="paragraph" w:styleId="145">
+  <w:style w:type="paragraph" w:styleId="833">
     <w:name w:val="Heading 7"/>
-    <w:basedOn w:val="664"/>
-    <w:next w:val="664"/>
-    <w:link w:val="156"/>
+    <w:basedOn w:val="886"/>
+    <w:next w:val="886"/>
+    <w:link w:val="843"/>
     <w:uiPriority w:val="9"/>
     <w:unhideWhenUsed/>
     <w:qFormat/>
@@ -31293,11 +31510,11 @@
       <w:color w:val="595959" w:themeColor="text1" w:themeTint="A6"/>
     </w:rPr>
   </w:style>
-  <w:style w:type="paragraph" w:styleId="146">
+  <w:style w:type="paragraph" w:styleId="834">
     <w:name w:val="Heading 8"/>
-    <w:basedOn w:val="664"/>
-    <w:next w:val="664"/>
-    <w:link w:val="157"/>
+    <w:basedOn w:val="886"/>
+    <w:next w:val="886"/>
+    <w:link w:val="844"/>
     <w:uiPriority w:val="9"/>
     <w:unhideWhenUsed/>
     <w:qFormat/>
@@ -31316,11 +31533,11 @@
       <w:color w:val="272727" w:themeColor="text1" w:themeTint="D8"/>
     </w:rPr>
   </w:style>
-  <w:style w:type="paragraph" w:styleId="147">
+  <w:style w:type="paragraph" w:styleId="835">
     <w:name w:val="Heading 9"/>
-    <w:basedOn w:val="664"/>
-    <w:next w:val="664"/>
-    <w:link w:val="158"/>
+    <w:basedOn w:val="886"/>
+    <w:next w:val="886"/>
+    <w:link w:val="845"/>
     <w:uiPriority w:val="9"/>
     <w:unhideWhenUsed/>
     <w:qFormat/>
@@ -31339,7 +31556,7 @@
       <w:color w:val="272727" w:themeColor="text1" w:themeTint="D8"/>
     </w:rPr>
   </w:style>
-  <w:style w:type="character" w:styleId="148" w:default="1">
+  <w:style w:type="character" w:styleId="836" w:default="1">
     <w:name w:val="Default Paragraph Font"/>
     <w:uiPriority w:val="1"/>
     <w:semiHidden/>
@@ -31350,10 +31567,10 @@
       <w:ind/>
     </w:pPr>
   </w:style>
-  <w:style w:type="character" w:styleId="150">
+  <w:style w:type="character" w:styleId="837">
     <w:name w:val="Heading 1 Char"/>
-    <w:basedOn w:val="148"/>
-    <w:link w:val="139"/>
+    <w:basedOn w:val="836"/>
+    <w:link w:val="827"/>
     <w:uiPriority w:val="9"/>
     <w:pPr>
       <w:pBdr/>
@@ -31367,10 +31584,10 @@
       <w:szCs w:val="40"/>
     </w:rPr>
   </w:style>
-  <w:style w:type="character" w:styleId="151">
+  <w:style w:type="character" w:styleId="838">
     <w:name w:val="Heading 2 Char"/>
-    <w:basedOn w:val="148"/>
-    <w:link w:val="140"/>
+    <w:basedOn w:val="836"/>
+    <w:link w:val="828"/>
     <w:uiPriority w:val="9"/>
     <w:pPr>
       <w:pBdr/>
@@ -31384,10 +31601,10 @@
       <w:szCs w:val="32"/>
     </w:rPr>
   </w:style>
-  <w:style w:type="character" w:styleId="152">
+  <w:style w:type="character" w:styleId="839">
     <w:name w:val="Heading 3 Char"/>
-    <w:basedOn w:val="148"/>
-    <w:link w:val="141"/>
+    <w:basedOn w:val="836"/>
+    <w:link w:val="829"/>
     <w:uiPriority w:val="9"/>
     <w:pPr>
       <w:pBdr/>
@@ -31401,10 +31618,10 @@
       <w:szCs w:val="28"/>
     </w:rPr>
   </w:style>
-  <w:style w:type="character" w:styleId="153">
+  <w:style w:type="character" w:styleId="840">
     <w:name w:val="Heading 4 Char"/>
-    <w:basedOn w:val="148"/>
-    <w:link w:val="142"/>
+    <w:basedOn w:val="836"/>
+    <w:link w:val="830"/>
     <w:uiPriority w:val="9"/>
     <w:pPr>
       <w:pBdr/>
@@ -31418,10 +31635,10 @@
       <w:color w:val="0f4761" w:themeColor="accent1" w:themeShade="BF"/>
     </w:rPr>
   </w:style>
-  <w:style w:type="character" w:styleId="154">
+  <w:style w:type="character" w:styleId="841">
     <w:name w:val="Heading 5 Char"/>
-    <w:basedOn w:val="148"/>
-    <w:link w:val="143"/>
+    <w:basedOn w:val="836"/>
+    <w:link w:val="831"/>
     <w:uiPriority w:val="9"/>
     <w:pPr>
       <w:pBdr/>
@@ -31433,10 +31650,10 @@
       <w:color w:val="0f4761" w:themeColor="accent1" w:themeShade="BF"/>
     </w:rPr>
   </w:style>
-  <w:style w:type="character" w:styleId="155">
+  <w:style w:type="character" w:styleId="842">
     <w:name w:val="Heading 6 Char"/>
-    <w:basedOn w:val="148"/>
-    <w:link w:val="144"/>
+    <w:basedOn w:val="836"/>
+    <w:link w:val="832"/>
     <w:uiPriority w:val="9"/>
     <w:pPr>
       <w:pBdr/>
@@ -31450,10 +31667,10 @@
       <w:color w:val="595959" w:themeColor="text1" w:themeTint="A6"/>
     </w:rPr>
   </w:style>
-  <w:style w:type="character" w:styleId="156">
+  <w:style w:type="character" w:styleId="843">
     <w:name w:val="Heading 7 Char"/>
-    <w:basedOn w:val="148"/>
-    <w:link w:val="145"/>
+    <w:basedOn w:val="836"/>
+    <w:link w:val="833"/>
     <w:uiPriority w:val="9"/>
     <w:pPr>
       <w:pBdr/>
@@ -31465,10 +31682,10 @@
       <w:color w:val="595959" w:themeColor="text1" w:themeTint="A6"/>
     </w:rPr>
   </w:style>
-  <w:style w:type="character" w:styleId="157">
+  <w:style w:type="character" w:styleId="844">
     <w:name w:val="Heading 8 Char"/>
-    <w:basedOn w:val="148"/>
-    <w:link w:val="146"/>
+    <w:basedOn w:val="836"/>
+    <w:link w:val="834"/>
     <w:uiPriority w:val="9"/>
     <w:pPr>
       <w:pBdr/>
@@ -31482,10 +31699,10 @@
       <w:color w:val="272727" w:themeColor="text1" w:themeTint="D8"/>
     </w:rPr>
   </w:style>
-  <w:style w:type="character" w:styleId="158">
+  <w:style w:type="character" w:styleId="845">
     <w:name w:val="Heading 9 Char"/>
-    <w:basedOn w:val="148"/>
-    <w:link w:val="147"/>
+    <w:basedOn w:val="836"/>
+    <w:link w:val="835"/>
     <w:uiPriority w:val="9"/>
     <w:pPr>
       <w:pBdr/>
@@ -31499,11 +31716,11 @@
       <w:color w:val="272727" w:themeColor="text1" w:themeTint="D8"/>
     </w:rPr>
   </w:style>
-  <w:style w:type="paragraph" w:styleId="159">
+  <w:style w:type="paragraph" w:styleId="846">
     <w:name w:val="Title"/>
-    <w:basedOn w:val="664"/>
-    <w:next w:val="664"/>
-    <w:link w:val="160"/>
+    <w:basedOn w:val="886"/>
+    <w:next w:val="886"/>
+    <w:link w:val="847"/>
     <w:uiPriority w:val="10"/>
     <w:qFormat/>
     <w:pPr>
@@ -31519,10 +31736,10 @@
       <w:szCs w:val="56"/>
     </w:rPr>
   </w:style>
-  <w:style w:type="character" w:styleId="160">
+  <w:style w:type="character" w:styleId="847">
     <w:name w:val="Title Char"/>
-    <w:basedOn w:val="148"/>
-    <w:link w:val="159"/>
+    <w:basedOn w:val="836"/>
+    <w:link w:val="846"/>
     <w:uiPriority w:val="10"/>
     <w:pPr>
       <w:pBdr/>
@@ -31536,11 +31753,11 @@
       <w:szCs w:val="56"/>
     </w:rPr>
   </w:style>
-  <w:style w:type="paragraph" w:styleId="161">
+  <w:style w:type="paragraph" w:styleId="848">
     <w:name w:val="Subtitle"/>
-    <w:basedOn w:val="664"/>
-    <w:next w:val="664"/>
-    <w:link w:val="162"/>
+    <w:basedOn w:val="886"/>
+    <w:next w:val="886"/>
+    <w:link w:val="849"/>
     <w:uiPriority w:val="11"/>
     <w:qFormat/>
     <w:pPr>
@@ -31558,10 +31775,10 @@
       <w:szCs w:val="28"/>
     </w:rPr>
   </w:style>
-  <w:style w:type="character" w:styleId="162">
+  <w:style w:type="character" w:styleId="849">
     <w:name w:val="Subtitle Char"/>
-    <w:basedOn w:val="148"/>
-    <w:link w:val="161"/>
+    <w:basedOn w:val="836"/>
+    <w:link w:val="848"/>
     <w:uiPriority w:val="11"/>
     <w:pPr>
       <w:pBdr/>
@@ -31575,11 +31792,11 @@
       <w:szCs w:val="28"/>
     </w:rPr>
   </w:style>
-  <w:style w:type="paragraph" w:styleId="163">
+  <w:style w:type="paragraph" w:styleId="850">
     <w:name w:val="Quote"/>
-    <w:basedOn w:val="664"/>
-    <w:next w:val="664"/>
-    <w:link w:val="164"/>
+    <w:basedOn w:val="886"/>
+    <w:next w:val="886"/>
+    <w:link w:val="851"/>
     <w:uiPriority w:val="29"/>
     <w:qFormat/>
     <w:pPr>
@@ -31594,10 +31811,10 @@
       <w:color w:val="404040" w:themeColor="text1" w:themeTint="BF"/>
     </w:rPr>
   </w:style>
-  <w:style w:type="character" w:styleId="164">
+  <w:style w:type="character" w:styleId="851">
     <w:name w:val="Quote Char"/>
-    <w:basedOn w:val="148"/>
-    <w:link w:val="163"/>
+    <w:basedOn w:val="836"/>
+    <w:link w:val="850"/>
     <w:uiPriority w:val="29"/>
     <w:pPr>
       <w:pBdr/>
@@ -31610,9 +31827,9 @@
       <w:color w:val="404040" w:themeColor="text1" w:themeTint="BF"/>
     </w:rPr>
   </w:style>
-  <w:style w:type="character" w:styleId="166">
+  <w:style w:type="character" w:styleId="852">
     <w:name w:val="Intense Emphasis"/>
-    <w:basedOn w:val="148"/>
+    <w:basedOn w:val="836"/>
     <w:uiPriority w:val="21"/>
     <w:qFormat/>
     <w:pPr>
@@ -31626,11 +31843,11 @@
       <w:color w:val="0f4761" w:themeColor="accent1" w:themeShade="BF"/>
     </w:rPr>
   </w:style>
-  <w:style w:type="paragraph" w:styleId="167">
+  <w:style w:type="paragraph" w:styleId="853">
     <w:name w:val="Intense Quote"/>
-    <w:basedOn w:val="664"/>
-    <w:next w:val="664"/>
-    <w:link w:val="168"/>
+    <w:basedOn w:val="886"/>
+    <w:next w:val="886"/>
+    <w:link w:val="854"/>
     <w:uiPriority w:val="30"/>
     <w:qFormat/>
     <w:pPr>
@@ -31648,10 +31865,10 @@
       <w:color w:val="0f4761" w:themeColor="accent1" w:themeShade="BF"/>
     </w:rPr>
   </w:style>
-  <w:style w:type="character" w:styleId="168">
+  <w:style w:type="character" w:styleId="854">
     <w:name w:val="Intense Quote Char"/>
-    <w:basedOn w:val="148"/>
-    <w:link w:val="167"/>
+    <w:basedOn w:val="836"/>
+    <w:link w:val="853"/>
     <w:uiPriority w:val="30"/>
     <w:pPr>
       <w:pBdr/>
@@ -31664,9 +31881,9 @@
       <w:color w:val="0f4761" w:themeColor="accent1" w:themeShade="BF"/>
     </w:rPr>
   </w:style>
-  <w:style w:type="character" w:styleId="169">
+  <w:style w:type="character" w:styleId="855">
     <w:name w:val="Intense Reference"/>
-    <w:basedOn w:val="148"/>
+    <w:basedOn w:val="836"/>
     <w:uiPriority w:val="32"/>
     <w:qFormat/>
     <w:pPr>
@@ -31682,9 +31899,9 @@
       <w:spacing w:val="5"/>
     </w:rPr>
   </w:style>
-  <w:style w:type="character" w:styleId="171">
+  <w:style w:type="character" w:styleId="856">
     <w:name w:val="Subtle Emphasis"/>
-    <w:basedOn w:val="148"/>
+    <w:basedOn w:val="836"/>
     <w:uiPriority w:val="19"/>
     <w:qFormat/>
     <w:pPr>
@@ -31698,9 +31915,9 @@
       <w:color w:val="404040" w:themeColor="text1" w:themeTint="BF"/>
     </w:rPr>
   </w:style>
-  <w:style w:type="character" w:styleId="172">
+  <w:style w:type="character" w:styleId="857">
     <w:name w:val="Emphasis"/>
-    <w:basedOn w:val="148"/>
+    <w:basedOn w:val="836"/>
     <w:uiPriority w:val="20"/>
     <w:qFormat/>
     <w:pPr>
@@ -31713,9 +31930,9 @@
       <w:iCs/>
     </w:rPr>
   </w:style>
-  <w:style w:type="character" w:styleId="173">
+  <w:style w:type="character" w:styleId="858">
     <w:name w:val="Strong"/>
-    <w:basedOn w:val="148"/>
+    <w:basedOn w:val="836"/>
     <w:uiPriority w:val="22"/>
     <w:qFormat/>
     <w:pPr>
@@ -31728,9 +31945,9 @@
       <w:bCs/>
     </w:rPr>
   </w:style>
-  <w:style w:type="character" w:styleId="174">
+  <w:style w:type="character" w:styleId="859">
     <w:name w:val="Subtle Reference"/>
-    <w:basedOn w:val="148"/>
+    <w:basedOn w:val="836"/>
     <w:uiPriority w:val="31"/>
     <w:qFormat/>
     <w:pPr>
@@ -31743,9 +31960,9 @@
       <w:color w:val="5a5a5a" w:themeColor="text1" w:themeTint="A5"/>
     </w:rPr>
   </w:style>
-  <w:style w:type="character" w:styleId="175">
+  <w:style w:type="character" w:styleId="860">
     <w:name w:val="Book Title"/>
-    <w:basedOn w:val="148"/>
+    <w:basedOn w:val="836"/>
     <w:uiPriority w:val="33"/>
     <w:qFormat/>
     <w:pPr>
@@ -31761,10 +31978,10 @@
       <w:spacing w:val="5"/>
     </w:rPr>
   </w:style>
-  <w:style w:type="paragraph" w:styleId="176">
+  <w:style w:type="paragraph" w:styleId="861">
     <w:name w:val="Header"/>
-    <w:basedOn w:val="664"/>
-    <w:link w:val="177"/>
+    <w:basedOn w:val="886"/>
+    <w:link w:val="862"/>
     <w:uiPriority w:val="99"/>
     <w:unhideWhenUsed/>
     <w:pPr>
@@ -31777,10 +31994,10 @@
       <w:ind/>
     </w:pPr>
   </w:style>
-  <w:style w:type="character" w:styleId="177">
+  <w:style w:type="character" w:styleId="862">
     <w:name w:val="Header Char"/>
-    <w:basedOn w:val="148"/>
-    <w:link w:val="176"/>
+    <w:basedOn w:val="836"/>
+    <w:link w:val="861"/>
     <w:uiPriority w:val="99"/>
     <w:pPr>
       <w:pBdr/>
@@ -31788,10 +32005,10 @@
       <w:ind/>
     </w:pPr>
   </w:style>
-  <w:style w:type="paragraph" w:styleId="178">
+  <w:style w:type="paragraph" w:styleId="863">
     <w:name w:val="Footer"/>
-    <w:basedOn w:val="664"/>
-    <w:link w:val="179"/>
+    <w:basedOn w:val="886"/>
+    <w:link w:val="864"/>
     <w:uiPriority w:val="99"/>
     <w:unhideWhenUsed/>
     <w:pPr>
@@ -31804,10 +32021,10 @@
       <w:ind/>
     </w:pPr>
   </w:style>
-  <w:style w:type="character" w:styleId="179">
+  <w:style w:type="character" w:styleId="864">
     <w:name w:val="Footer Char"/>
-    <w:basedOn w:val="148"/>
-    <w:link w:val="178"/>
+    <w:basedOn w:val="836"/>
+    <w:link w:val="863"/>
     <w:uiPriority w:val="99"/>
     <w:pPr>
       <w:pBdr/>
@@ -31815,10 +32032,10 @@
       <w:ind/>
     </w:pPr>
   </w:style>
-  <w:style w:type="paragraph" w:styleId="180">
+  <w:style w:type="paragraph" w:styleId="865">
     <w:name w:val="Caption"/>
-    <w:basedOn w:val="664"/>
-    <w:next w:val="664"/>
+    <w:basedOn w:val="886"/>
+    <w:next w:val="886"/>
     <w:uiPriority w:val="35"/>
     <w:unhideWhenUsed/>
     <w:qFormat/>
@@ -31835,10 +32052,10 @@
       <w:szCs w:val="18"/>
     </w:rPr>
   </w:style>
-  <w:style w:type="paragraph" w:styleId="181">
+  <w:style w:type="paragraph" w:styleId="866">
     <w:name w:val="footnote text"/>
-    <w:basedOn w:val="664"/>
-    <w:link w:val="182"/>
+    <w:basedOn w:val="886"/>
+    <w:link w:val="867"/>
     <w:uiPriority w:val="99"/>
     <w:semiHidden/>
     <w:unhideWhenUsed/>
@@ -31852,10 +32069,10 @@
       <w:szCs w:val="20"/>
     </w:rPr>
   </w:style>
-  <w:style w:type="character" w:styleId="182">
+  <w:style w:type="character" w:styleId="867">
     <w:name w:val="Footnote Text Char"/>
-    <w:basedOn w:val="148"/>
-    <w:link w:val="181"/>
+    <w:basedOn w:val="836"/>
+    <w:link w:val="866"/>
     <w:uiPriority w:val="99"/>
     <w:semiHidden/>
     <w:pPr>
@@ -31868,9 +32085,9 @@
       <w:szCs w:val="20"/>
     </w:rPr>
   </w:style>
-  <w:style w:type="character" w:styleId="183">
+  <w:style w:type="character" w:styleId="868">
     <w:name w:val="footnote reference"/>
-    <w:basedOn w:val="148"/>
+    <w:basedOn w:val="836"/>
     <w:uiPriority w:val="99"/>
     <w:semiHidden/>
     <w:unhideWhenUsed/>
@@ -31883,10 +32100,10 @@
       <w:vertAlign w:val="superscript"/>
     </w:rPr>
   </w:style>
-  <w:style w:type="paragraph" w:styleId="184">
+  <w:style w:type="paragraph" w:styleId="869">
     <w:name w:val="endnote text"/>
-    <w:basedOn w:val="664"/>
-    <w:link w:val="185"/>
+    <w:basedOn w:val="886"/>
+    <w:link w:val="870"/>
     <w:uiPriority w:val="99"/>
     <w:semiHidden/>
     <w:unhideWhenUsed/>
@@ -31900,10 +32117,10 @@
       <w:szCs w:val="20"/>
     </w:rPr>
   </w:style>
-  <w:style w:type="character" w:styleId="185">
+  <w:style w:type="character" w:styleId="870">
     <w:name w:val="Endnote Text Char"/>
-    <w:basedOn w:val="148"/>
-    <w:link w:val="184"/>
+    <w:basedOn w:val="836"/>
+    <w:link w:val="869"/>
     <w:uiPriority w:val="99"/>
     <w:semiHidden/>
     <w:pPr>
@@ -31916,9 +32133,9 @@
       <w:szCs w:val="20"/>
     </w:rPr>
   </w:style>
-  <w:style w:type="character" w:styleId="186">
+  <w:style w:type="character" w:styleId="871">
     <w:name w:val="endnote reference"/>
-    <w:basedOn w:val="148"/>
+    <w:basedOn w:val="836"/>
     <w:uiPriority w:val="99"/>
     <w:semiHidden/>
     <w:unhideWhenUsed/>
@@ -31931,9 +32148,9 @@
       <w:vertAlign w:val="superscript"/>
     </w:rPr>
   </w:style>
-  <w:style w:type="character" w:styleId="187">
+  <w:style w:type="character" w:styleId="872">
     <w:name w:val="Hyperlink"/>
-    <w:basedOn w:val="148"/>
+    <w:basedOn w:val="836"/>
     <w:uiPriority w:val="99"/>
     <w:unhideWhenUsed/>
     <w:pPr>
@@ -31946,9 +32163,9 @@
       <w:u w:val="single"/>
     </w:rPr>
   </w:style>
-  <w:style w:type="character" w:styleId="188">
+  <w:style w:type="character" w:styleId="873">
     <w:name w:val="FollowedHyperlink"/>
-    <w:basedOn w:val="148"/>
+    <w:basedOn w:val="836"/>
     <w:uiPriority w:val="99"/>
     <w:semiHidden/>
     <w:unhideWhenUsed/>
@@ -31962,10 +32179,10 @@
       <w:u w:val="single"/>
     </w:rPr>
   </w:style>
-  <w:style w:type="paragraph" w:styleId="189">
+  <w:style w:type="paragraph" w:styleId="874">
     <w:name w:val="toc 1"/>
-    <w:basedOn w:val="664"/>
-    <w:next w:val="664"/>
+    <w:basedOn w:val="886"/>
+    <w:next w:val="886"/>
     <w:uiPriority w:val="39"/>
     <w:unhideWhenUsed/>
     <w:pPr>
@@ -31974,10 +32191,10 @@
       <w:ind/>
     </w:pPr>
   </w:style>
-  <w:style w:type="paragraph" w:styleId="190">
+  <w:style w:type="paragraph" w:styleId="875">
     <w:name w:val="toc 2"/>
-    <w:basedOn w:val="664"/>
-    <w:next w:val="664"/>
+    <w:basedOn w:val="886"/>
+    <w:next w:val="886"/>
     <w:uiPriority w:val="39"/>
     <w:unhideWhenUsed/>
     <w:pPr>
@@ -31986,10 +32203,10 @@
       <w:ind w:left="220"/>
     </w:pPr>
   </w:style>
-  <w:style w:type="paragraph" w:styleId="191">
+  <w:style w:type="paragraph" w:styleId="876">
     <w:name w:val="toc 3"/>
-    <w:basedOn w:val="664"/>
-    <w:next w:val="664"/>
+    <w:basedOn w:val="886"/>
+    <w:next w:val="886"/>
     <w:uiPriority w:val="39"/>
     <w:unhideWhenUsed/>
     <w:pPr>
@@ -31998,10 +32215,10 @@
       <w:ind w:left="440"/>
     </w:pPr>
   </w:style>
-  <w:style w:type="paragraph" w:styleId="192">
+  <w:style w:type="paragraph" w:styleId="877">
     <w:name w:val="toc 4"/>
-    <w:basedOn w:val="664"/>
-    <w:next w:val="664"/>
+    <w:basedOn w:val="886"/>
+    <w:next w:val="886"/>
     <w:uiPriority w:val="39"/>
     <w:unhideWhenUsed/>
     <w:pPr>
@@ -32010,10 +32227,10 @@
       <w:ind w:left="660"/>
     </w:pPr>
   </w:style>
-  <w:style w:type="paragraph" w:styleId="193">
+  <w:style w:type="paragraph" w:styleId="878">
     <w:name w:val="toc 5"/>
-    <w:basedOn w:val="664"/>
-    <w:next w:val="664"/>
+    <w:basedOn w:val="886"/>
+    <w:next w:val="886"/>
     <w:uiPriority w:val="39"/>
     <w:unhideWhenUsed/>
     <w:pPr>
@@ -32022,10 +32239,10 @@
       <w:ind w:left="880"/>
     </w:pPr>
   </w:style>
-  <w:style w:type="paragraph" w:styleId="194">
+  <w:style w:type="paragraph" w:styleId="879">
     <w:name w:val="toc 6"/>
-    <w:basedOn w:val="664"/>
-    <w:next w:val="664"/>
+    <w:basedOn w:val="886"/>
+    <w:next w:val="886"/>
     <w:uiPriority w:val="39"/>
     <w:unhideWhenUsed/>
     <w:pPr>
@@ -32034,10 +32251,10 @@
       <w:ind w:left="1100"/>
     </w:pPr>
   </w:style>
-  <w:style w:type="paragraph" w:styleId="195">
+  <w:style w:type="paragraph" w:styleId="880">
     <w:name w:val="toc 7"/>
-    <w:basedOn w:val="664"/>
-    <w:next w:val="664"/>
+    <w:basedOn w:val="886"/>
+    <w:next w:val="886"/>
     <w:uiPriority w:val="39"/>
     <w:unhideWhenUsed/>
     <w:pPr>
@@ -32046,10 +32263,10 @@
       <w:ind w:left="1320"/>
     </w:pPr>
   </w:style>
-  <w:style w:type="paragraph" w:styleId="196">
+  <w:style w:type="paragraph" w:styleId="881">
     <w:name w:val="toc 8"/>
-    <w:basedOn w:val="664"/>
-    <w:next w:val="664"/>
+    <w:basedOn w:val="886"/>
+    <w:next w:val="886"/>
     <w:uiPriority w:val="39"/>
     <w:unhideWhenUsed/>
     <w:pPr>
@@ -32058,10 +32275,10 @@
       <w:ind w:left="1540"/>
     </w:pPr>
   </w:style>
-  <w:style w:type="paragraph" w:styleId="197">
+  <w:style w:type="paragraph" w:styleId="882">
     <w:name w:val="toc 9"/>
-    <w:basedOn w:val="664"/>
-    <w:next w:val="664"/>
+    <w:basedOn w:val="886"/>
+    <w:next w:val="886"/>
     <w:uiPriority w:val="39"/>
     <w:unhideWhenUsed/>
     <w:pPr>
@@ -32070,9 +32287,9 @@
       <w:ind w:left="1760"/>
     </w:pPr>
   </w:style>
-  <w:style w:type="character" w:styleId="198">
+  <w:style w:type="character" w:styleId="883">
     <w:name w:val="Placeholder Text"/>
-    <w:basedOn w:val="148"/>
+    <w:basedOn w:val="836"/>
     <w:uiPriority w:val="99"/>
     <w:semiHidden/>
     <w:pPr>
@@ -32084,7 +32301,7 @@
       <w:color w:val="666666"/>
     </w:rPr>
   </w:style>
-  <w:style w:type="paragraph" w:styleId="208">
+  <w:style w:type="paragraph" w:styleId="884">
     <w:name w:val="TOC Heading"/>
     <w:uiPriority w:val="39"/>
     <w:unhideWhenUsed/>
@@ -32094,10 +32311,10 @@
       <w:ind/>
     </w:pPr>
   </w:style>
-  <w:style w:type="paragraph" w:styleId="209">
+  <w:style w:type="paragraph" w:styleId="885">
     <w:name w:val="table of figures"/>
-    <w:basedOn w:val="664"/>
-    <w:next w:val="664"/>
+    <w:basedOn w:val="886"/>
+    <w:next w:val="886"/>
     <w:uiPriority w:val="99"/>
     <w:unhideWhenUsed/>
     <w:pPr>
@@ -32106,7 +32323,7 @@
       <w:ind/>
     </w:pPr>
   </w:style>
-  <w:style w:type="paragraph" w:styleId="664" w:default="1">
+  <w:style w:type="paragraph" w:styleId="886" w:default="1">
     <w:name w:val="Normal"/>
     <w:qFormat/>
     <w:pPr>
@@ -32115,7 +32332,7 @@
       <w:ind/>
     </w:pPr>
   </w:style>
-  <w:style w:type="table" w:styleId="665" w:default="1">
+  <w:style w:type="table" w:styleId="887" w:default="1">
     <w:name w:val="Normal Table"/>
     <w:uiPriority w:val="99"/>
     <w:semiHidden/>
@@ -32308,7 +32525,7 @@
       </w:tcPr>
     </w:tblStylePr>
   </w:style>
-  <w:style w:type="numbering" w:styleId="666" w:default="1">
+  <w:style w:type="numbering" w:styleId="888" w:default="1">
     <w:name w:val="No List"/>
     <w:uiPriority w:val="99"/>
     <w:semiHidden/>
@@ -32319,9 +32536,9 @@
       <w:ind/>
     </w:pPr>
   </w:style>
-  <w:style w:type="paragraph" w:styleId="667">
+  <w:style w:type="paragraph" w:styleId="889">
     <w:name w:val="No Spacing"/>
-    <w:basedOn w:val="664"/>
+    <w:basedOn w:val="886"/>
     <w:uiPriority w:val="1"/>
     <w:qFormat/>
     <w:pPr>
@@ -32330,9 +32547,9 @@
       <w:ind/>
     </w:pPr>
   </w:style>
-  <w:style w:type="paragraph" w:styleId="668">
+  <w:style w:type="paragraph" w:styleId="890">
     <w:name w:val="List Paragraph"/>
-    <w:basedOn w:val="664"/>
+    <w:basedOn w:val="886"/>
     <w:uiPriority w:val="34"/>
     <w:qFormat/>
     <w:pPr>

</xml_diff>